<commit_message>
docs: add Section 5 build progress log to feature audit roadmap
</commit_message>
<xml_diff>
--- a/YAHWEH_HRMS_Feature_Audit_Roadmap.docx
+++ b/YAHWEH_HRMS_Feature_Audit_Roadmap.docx
@@ -59,7 +59,7 @@
           <w:color w:val="FFFFFF"/>
           <w:sz w:val="15"/>
           <w:szCs w:val="15"/>
-          <w:shd w:fill="059669" w:val="clear"/>
+          <w:shd w:val="clear" w:color="auto" w:fill="059669"/>
         </w:rPr>
         <w:t xml:space="preserve"> ✓ COMPLETE </w:t>
       </w:r>
@@ -80,7 +80,7 @@
           <w:color w:val="FFFFFF"/>
           <w:sz w:val="15"/>
           <w:szCs w:val="15"/>
-          <w:shd w:fill="0891B2" w:val="clear"/>
+          <w:shd w:val="clear" w:color="auto" w:fill="0891B2"/>
         </w:rPr>
         <w:t xml:space="preserve"> ● SOLID </w:t>
       </w:r>
@@ -101,7 +101,7 @@
           <w:color w:val="FFFFFF"/>
           <w:sz w:val="15"/>
           <w:szCs w:val="15"/>
-          <w:shd w:fill="D97706" w:val="clear"/>
+          <w:shd w:val="clear" w:color="auto" w:fill="D97706"/>
         </w:rPr>
         <w:t xml:space="preserve"> ▲ THIN </w:t>
       </w:r>
@@ -122,7 +122,7 @@
           <w:color w:val="FFFFFF"/>
           <w:sz w:val="15"/>
           <w:szCs w:val="15"/>
-          <w:shd w:fill="DC2626" w:val="clear"/>
+          <w:shd w:val="clear" w:color="auto" w:fill="DC2626"/>
         </w:rPr>
         <w:t xml:space="preserve"> ○ STUB </w:t>
       </w:r>
@@ -143,7 +143,7 @@
           <w:color w:val="FFFFFF"/>
           <w:sz w:val="15"/>
           <w:szCs w:val="15"/>
-          <w:shd w:fill="7C3AED" w:val="clear"/>
+          <w:shd w:val="clear" w:color="auto" w:fill="7C3AED"/>
         </w:rPr>
         <w:t xml:space="preserve"> ★ NEW </w:t>
       </w:r>
@@ -221,7 +221,6 @@
         <w:tc>
           <w:tcPr>
             <w:tcW w:type="dxa" w:w="4500"/>
-            <w:shd w:fill="4338CA" w:val="clear"/>
             <w:tcMar>
               <w:top w:type="dxa" w:w="80"/>
               <w:left w:type="dxa" w:w="120"/>
@@ -245,7 +244,6 @@
         <w:tc>
           <w:tcPr>
             <w:tcW w:type="dxa" w:w="1600"/>
-            <w:shd w:fill="4338CA" w:val="clear"/>
             <w:tcMar>
               <w:top w:type="dxa" w:w="80"/>
               <w:left w:type="dxa" w:w="120"/>
@@ -269,7 +267,6 @@
         <w:tc>
           <w:tcPr>
             <w:tcW w:type="dxa" w:w="4000"/>
-            <w:shd w:fill="4338CA" w:val="clear"/>
             <w:tcMar>
               <w:top w:type="dxa" w:w="80"/>
               <w:left w:type="dxa" w:w="120"/>
@@ -293,7 +290,6 @@
         <w:tc>
           <w:tcPr>
             <w:tcW w:type="dxa" w:w="4140"/>
-            <w:shd w:fill="4338CA" w:val="clear"/>
             <w:tcMar>
               <w:top w:type="dxa" w:w="80"/>
               <w:left w:type="dxa" w:w="120"/>
@@ -319,7 +315,7 @@
         <w:tc>
           <w:tcPr>
             <w:tcW w:type="dxa" w:w="4500"/>
-            <w:shd w:fill="F9FAFB" w:val="clear"/>
+            <w:shd w:val="clear" w:color="auto" w:fill="F9FAFB"/>
             <w:tcMar>
               <w:top w:type="dxa" w:w="80"/>
               <w:left w:type="dxa" w:w="120"/>
@@ -355,7 +351,7 @@
         <w:tc>
           <w:tcPr>
             <w:tcW w:type="dxa" w:w="1600"/>
-            <w:shd w:fill="F9FAFB" w:val="clear"/>
+            <w:shd w:val="clear" w:color="auto" w:fill="F9FAFB"/>
             <w:tcMar>
               <w:top w:type="dxa" w:w="80"/>
               <w:left w:type="dxa" w:w="120"/>
@@ -371,7 +367,7 @@
                 <w:color w:val="FFFFFF"/>
                 <w:sz w:val="15"/>
                 <w:szCs w:val="15"/>
-                <w:shd w:fill="0891B2" w:val="clear"/>
+                <w:shd w:val="clear" w:color="auto" w:fill="0891B2"/>
               </w:rPr>
               <w:t xml:space="preserve"> ● SOLID </w:t>
             </w:r>
@@ -380,7 +376,7 @@
         <w:tc>
           <w:tcPr>
             <w:tcW w:type="dxa" w:w="4000"/>
-            <w:shd w:fill="F9FAFB" w:val="clear"/>
+            <w:shd w:val="clear" w:color="auto" w:fill="F9FAFB"/>
             <w:tcMar>
               <w:top w:type="dxa" w:w="80"/>
               <w:left w:type="dxa" w:w="120"/>
@@ -402,7 +398,7 @@
         <w:tc>
           <w:tcPr>
             <w:tcW w:type="dxa" w:w="4140"/>
-            <w:shd w:fill="F9FAFB" w:val="clear"/>
+            <w:shd w:val="clear" w:color="auto" w:fill="F9FAFB"/>
             <w:tcMar>
               <w:top w:type="dxa" w:w="80"/>
               <w:left w:type="dxa" w:w="120"/>
@@ -426,7 +422,7 @@
         <w:tc>
           <w:tcPr>
             <w:tcW w:type="dxa" w:w="4500"/>
-            <w:shd w:fill="FFFFFF" w:val="clear"/>
+            <w:shd w:val="clear" w:color="auto" w:fill="FFFFFF"/>
             <w:tcMar>
               <w:top w:type="dxa" w:w="80"/>
               <w:left w:type="dxa" w:w="120"/>
@@ -462,7 +458,7 @@
         <w:tc>
           <w:tcPr>
             <w:tcW w:type="dxa" w:w="1600"/>
-            <w:shd w:fill="FFFFFF" w:val="clear"/>
+            <w:shd w:val="clear" w:color="auto" w:fill="FFFFFF"/>
             <w:tcMar>
               <w:top w:type="dxa" w:w="80"/>
               <w:left w:type="dxa" w:w="120"/>
@@ -478,7 +474,7 @@
                 <w:color w:val="FFFFFF"/>
                 <w:sz w:val="15"/>
                 <w:szCs w:val="15"/>
-                <w:shd w:fill="0891B2" w:val="clear"/>
+                <w:shd w:val="clear" w:color="auto" w:fill="0891B2"/>
               </w:rPr>
               <w:t xml:space="preserve"> ● SOLID </w:t>
             </w:r>
@@ -487,7 +483,7 @@
         <w:tc>
           <w:tcPr>
             <w:tcW w:type="dxa" w:w="4000"/>
-            <w:shd w:fill="FFFFFF" w:val="clear"/>
+            <w:shd w:val="clear" w:color="auto" w:fill="FFFFFF"/>
             <w:tcMar>
               <w:top w:type="dxa" w:w="80"/>
               <w:left w:type="dxa" w:w="120"/>
@@ -509,7 +505,7 @@
         <w:tc>
           <w:tcPr>
             <w:tcW w:type="dxa" w:w="4140"/>
-            <w:shd w:fill="FFFFFF" w:val="clear"/>
+            <w:shd w:val="clear" w:color="auto" w:fill="FFFFFF"/>
             <w:tcMar>
               <w:top w:type="dxa" w:w="80"/>
               <w:left w:type="dxa" w:w="120"/>
@@ -533,7 +529,7 @@
         <w:tc>
           <w:tcPr>
             <w:tcW w:type="dxa" w:w="4500"/>
-            <w:shd w:fill="F9FAFB" w:val="clear"/>
+            <w:shd w:val="clear" w:color="auto" w:fill="F9FAFB"/>
             <w:tcMar>
               <w:top w:type="dxa" w:w="80"/>
               <w:left w:type="dxa" w:w="120"/>
@@ -569,7 +565,7 @@
         <w:tc>
           <w:tcPr>
             <w:tcW w:type="dxa" w:w="1600"/>
-            <w:shd w:fill="F9FAFB" w:val="clear"/>
+            <w:shd w:val="clear" w:color="auto" w:fill="F9FAFB"/>
             <w:tcMar>
               <w:top w:type="dxa" w:w="80"/>
               <w:left w:type="dxa" w:w="120"/>
@@ -585,7 +581,7 @@
                 <w:color w:val="FFFFFF"/>
                 <w:sz w:val="15"/>
                 <w:szCs w:val="15"/>
-                <w:shd w:fill="D97706" w:val="clear"/>
+                <w:shd w:val="clear" w:color="auto" w:fill="D97706"/>
               </w:rPr>
               <w:t xml:space="preserve"> ▲ THIN </w:t>
             </w:r>
@@ -594,7 +590,7 @@
         <w:tc>
           <w:tcPr>
             <w:tcW w:type="dxa" w:w="4000"/>
-            <w:shd w:fill="F9FAFB" w:val="clear"/>
+            <w:shd w:val="clear" w:color="auto" w:fill="F9FAFB"/>
             <w:tcMar>
               <w:top w:type="dxa" w:w="80"/>
               <w:left w:type="dxa" w:w="120"/>
@@ -616,7 +612,7 @@
         <w:tc>
           <w:tcPr>
             <w:tcW w:type="dxa" w:w="4140"/>
-            <w:shd w:fill="F9FAFB" w:val="clear"/>
+            <w:shd w:val="clear" w:color="auto" w:fill="F9FAFB"/>
             <w:tcMar>
               <w:top w:type="dxa" w:w="80"/>
               <w:left w:type="dxa" w:w="120"/>
@@ -640,7 +636,7 @@
         <w:tc>
           <w:tcPr>
             <w:tcW w:type="dxa" w:w="4500"/>
-            <w:shd w:fill="FFFFFF" w:val="clear"/>
+            <w:shd w:val="clear" w:color="auto" w:fill="FFFFFF"/>
             <w:tcMar>
               <w:top w:type="dxa" w:w="80"/>
               <w:left w:type="dxa" w:w="120"/>
@@ -676,7 +672,7 @@
         <w:tc>
           <w:tcPr>
             <w:tcW w:type="dxa" w:w="1600"/>
-            <w:shd w:fill="FFFFFF" w:val="clear"/>
+            <w:shd w:val="clear" w:color="auto" w:fill="FFFFFF"/>
             <w:tcMar>
               <w:top w:type="dxa" w:w="80"/>
               <w:left w:type="dxa" w:w="120"/>
@@ -692,7 +688,7 @@
                 <w:color w:val="FFFFFF"/>
                 <w:sz w:val="15"/>
                 <w:szCs w:val="15"/>
-                <w:shd w:fill="0891B2" w:val="clear"/>
+                <w:shd w:val="clear" w:color="auto" w:fill="0891B2"/>
               </w:rPr>
               <w:t xml:space="preserve"> ● SOLID </w:t>
             </w:r>
@@ -701,7 +697,7 @@
         <w:tc>
           <w:tcPr>
             <w:tcW w:type="dxa" w:w="4000"/>
-            <w:shd w:fill="FFFFFF" w:val="clear"/>
+            <w:shd w:val="clear" w:color="auto" w:fill="FFFFFF"/>
             <w:tcMar>
               <w:top w:type="dxa" w:w="80"/>
               <w:left w:type="dxa" w:w="120"/>
@@ -723,7 +719,7 @@
         <w:tc>
           <w:tcPr>
             <w:tcW w:type="dxa" w:w="4140"/>
-            <w:shd w:fill="FFFFFF" w:val="clear"/>
+            <w:shd w:val="clear" w:color="auto" w:fill="FFFFFF"/>
             <w:tcMar>
               <w:top w:type="dxa" w:w="80"/>
               <w:left w:type="dxa" w:w="120"/>
@@ -747,7 +743,7 @@
         <w:tc>
           <w:tcPr>
             <w:tcW w:type="dxa" w:w="4500"/>
-            <w:shd w:fill="F9FAFB" w:val="clear"/>
+            <w:shd w:val="clear" w:color="auto" w:fill="F9FAFB"/>
             <w:tcMar>
               <w:top w:type="dxa" w:w="80"/>
               <w:left w:type="dxa" w:w="120"/>
@@ -783,7 +779,7 @@
         <w:tc>
           <w:tcPr>
             <w:tcW w:type="dxa" w:w="1600"/>
-            <w:shd w:fill="F9FAFB" w:val="clear"/>
+            <w:shd w:val="clear" w:color="auto" w:fill="F9FAFB"/>
             <w:tcMar>
               <w:top w:type="dxa" w:w="80"/>
               <w:left w:type="dxa" w:w="120"/>
@@ -799,7 +795,7 @@
                 <w:color w:val="FFFFFF"/>
                 <w:sz w:val="15"/>
                 <w:szCs w:val="15"/>
-                <w:shd w:fill="0891B2" w:val="clear"/>
+                <w:shd w:val="clear" w:color="auto" w:fill="0891B2"/>
               </w:rPr>
               <w:t xml:space="preserve"> ● SOLID </w:t>
             </w:r>
@@ -808,7 +804,7 @@
         <w:tc>
           <w:tcPr>
             <w:tcW w:type="dxa" w:w="4000"/>
-            <w:shd w:fill="F9FAFB" w:val="clear"/>
+            <w:shd w:val="clear" w:color="auto" w:fill="F9FAFB"/>
             <w:tcMar>
               <w:top w:type="dxa" w:w="80"/>
               <w:left w:type="dxa" w:w="120"/>
@@ -830,7 +826,7 @@
         <w:tc>
           <w:tcPr>
             <w:tcW w:type="dxa" w:w="4140"/>
-            <w:shd w:fill="F9FAFB" w:val="clear"/>
+            <w:shd w:val="clear" w:color="auto" w:fill="F9FAFB"/>
             <w:tcMar>
               <w:top w:type="dxa" w:w="80"/>
               <w:left w:type="dxa" w:w="120"/>
@@ -854,7 +850,7 @@
         <w:tc>
           <w:tcPr>
             <w:tcW w:type="dxa" w:w="4500"/>
-            <w:shd w:fill="FFFFFF" w:val="clear"/>
+            <w:shd w:val="clear" w:color="auto" w:fill="FFFFFF"/>
             <w:tcMar>
               <w:top w:type="dxa" w:w="80"/>
               <w:left w:type="dxa" w:w="120"/>
@@ -890,7 +886,7 @@
         <w:tc>
           <w:tcPr>
             <w:tcW w:type="dxa" w:w="1600"/>
-            <w:shd w:fill="FFFFFF" w:val="clear"/>
+            <w:shd w:val="clear" w:color="auto" w:fill="FFFFFF"/>
             <w:tcMar>
               <w:top w:type="dxa" w:w="80"/>
               <w:left w:type="dxa" w:w="120"/>
@@ -906,7 +902,7 @@
                 <w:color w:val="FFFFFF"/>
                 <w:sz w:val="15"/>
                 <w:szCs w:val="15"/>
-                <w:shd w:fill="0891B2" w:val="clear"/>
+                <w:shd w:val="clear" w:color="auto" w:fill="0891B2"/>
               </w:rPr>
               <w:t xml:space="preserve"> ● SOLID </w:t>
             </w:r>
@@ -915,7 +911,7 @@
         <w:tc>
           <w:tcPr>
             <w:tcW w:type="dxa" w:w="4000"/>
-            <w:shd w:fill="FFFFFF" w:val="clear"/>
+            <w:shd w:val="clear" w:color="auto" w:fill="FFFFFF"/>
             <w:tcMar>
               <w:top w:type="dxa" w:w="80"/>
               <w:left w:type="dxa" w:w="120"/>
@@ -937,7 +933,7 @@
         <w:tc>
           <w:tcPr>
             <w:tcW w:type="dxa" w:w="4140"/>
-            <w:shd w:fill="FFFFFF" w:val="clear"/>
+            <w:shd w:val="clear" w:color="auto" w:fill="FFFFFF"/>
             <w:tcMar>
               <w:top w:type="dxa" w:w="80"/>
               <w:left w:type="dxa" w:w="120"/>
@@ -961,7 +957,7 @@
         <w:tc>
           <w:tcPr>
             <w:tcW w:type="dxa" w:w="4500"/>
-            <w:shd w:fill="F9FAFB" w:val="clear"/>
+            <w:shd w:val="clear" w:color="auto" w:fill="F9FAFB"/>
             <w:tcMar>
               <w:top w:type="dxa" w:w="80"/>
               <w:left w:type="dxa" w:w="120"/>
@@ -997,7 +993,7 @@
         <w:tc>
           <w:tcPr>
             <w:tcW w:type="dxa" w:w="1600"/>
-            <w:shd w:fill="F9FAFB" w:val="clear"/>
+            <w:shd w:val="clear" w:color="auto" w:fill="F9FAFB"/>
             <w:tcMar>
               <w:top w:type="dxa" w:w="80"/>
               <w:left w:type="dxa" w:w="120"/>
@@ -1013,7 +1009,7 @@
                 <w:color w:val="FFFFFF"/>
                 <w:sz w:val="15"/>
                 <w:szCs w:val="15"/>
-                <w:shd w:fill="D97706" w:val="clear"/>
+                <w:shd w:val="clear" w:color="auto" w:fill="D97706"/>
               </w:rPr>
               <w:t xml:space="preserve"> ▲ THIN </w:t>
             </w:r>
@@ -1022,7 +1018,7 @@
         <w:tc>
           <w:tcPr>
             <w:tcW w:type="dxa" w:w="4000"/>
-            <w:shd w:fill="F9FAFB" w:val="clear"/>
+            <w:shd w:val="clear" w:color="auto" w:fill="F9FAFB"/>
             <w:tcMar>
               <w:top w:type="dxa" w:w="80"/>
               <w:left w:type="dxa" w:w="120"/>
@@ -1044,7 +1040,7 @@
         <w:tc>
           <w:tcPr>
             <w:tcW w:type="dxa" w:w="4140"/>
-            <w:shd w:fill="F9FAFB" w:val="clear"/>
+            <w:shd w:val="clear" w:color="auto" w:fill="F9FAFB"/>
             <w:tcMar>
               <w:top w:type="dxa" w:w="80"/>
               <w:left w:type="dxa" w:w="120"/>
@@ -1068,7 +1064,7 @@
         <w:tc>
           <w:tcPr>
             <w:tcW w:type="dxa" w:w="4500"/>
-            <w:shd w:fill="FFFFFF" w:val="clear"/>
+            <w:shd w:val="clear" w:color="auto" w:fill="FFFFFF"/>
             <w:tcMar>
               <w:top w:type="dxa" w:w="80"/>
               <w:left w:type="dxa" w:w="120"/>
@@ -1104,7 +1100,7 @@
         <w:tc>
           <w:tcPr>
             <w:tcW w:type="dxa" w:w="1600"/>
-            <w:shd w:fill="FFFFFF" w:val="clear"/>
+            <w:shd w:val="clear" w:color="auto" w:fill="FFFFFF"/>
             <w:tcMar>
               <w:top w:type="dxa" w:w="80"/>
               <w:left w:type="dxa" w:w="120"/>
@@ -1120,7 +1116,7 @@
                 <w:color w:val="FFFFFF"/>
                 <w:sz w:val="15"/>
                 <w:szCs w:val="15"/>
-                <w:shd w:fill="0891B2" w:val="clear"/>
+                <w:shd w:val="clear" w:color="auto" w:fill="0891B2"/>
               </w:rPr>
               <w:t xml:space="preserve"> ● SOLID </w:t>
             </w:r>
@@ -1129,7 +1125,7 @@
         <w:tc>
           <w:tcPr>
             <w:tcW w:type="dxa" w:w="4000"/>
-            <w:shd w:fill="FFFFFF" w:val="clear"/>
+            <w:shd w:val="clear" w:color="auto" w:fill="FFFFFF"/>
             <w:tcMar>
               <w:top w:type="dxa" w:w="80"/>
               <w:left w:type="dxa" w:w="120"/>
@@ -1151,7 +1147,7 @@
         <w:tc>
           <w:tcPr>
             <w:tcW w:type="dxa" w:w="4140"/>
-            <w:shd w:fill="FFFFFF" w:val="clear"/>
+            <w:shd w:val="clear" w:color="auto" w:fill="FFFFFF"/>
             <w:tcMar>
               <w:top w:type="dxa" w:w="80"/>
               <w:left w:type="dxa" w:w="120"/>
@@ -1175,7 +1171,7 @@
         <w:tc>
           <w:tcPr>
             <w:tcW w:type="dxa" w:w="4500"/>
-            <w:shd w:fill="F9FAFB" w:val="clear"/>
+            <w:shd w:val="clear" w:color="auto" w:fill="F9FAFB"/>
             <w:tcMar>
               <w:top w:type="dxa" w:w="80"/>
               <w:left w:type="dxa" w:w="120"/>
@@ -1211,7 +1207,7 @@
         <w:tc>
           <w:tcPr>
             <w:tcW w:type="dxa" w:w="1600"/>
-            <w:shd w:fill="F9FAFB" w:val="clear"/>
+            <w:shd w:val="clear" w:color="auto" w:fill="F9FAFB"/>
             <w:tcMar>
               <w:top w:type="dxa" w:w="80"/>
               <w:left w:type="dxa" w:w="120"/>
@@ -1227,7 +1223,7 @@
                 <w:color w:val="FFFFFF"/>
                 <w:sz w:val="15"/>
                 <w:szCs w:val="15"/>
-                <w:shd w:fill="0891B2" w:val="clear"/>
+                <w:shd w:val="clear" w:color="auto" w:fill="0891B2"/>
               </w:rPr>
               <w:t xml:space="preserve"> ● SOLID </w:t>
             </w:r>
@@ -1236,7 +1232,7 @@
         <w:tc>
           <w:tcPr>
             <w:tcW w:type="dxa" w:w="4000"/>
-            <w:shd w:fill="F9FAFB" w:val="clear"/>
+            <w:shd w:val="clear" w:color="auto" w:fill="F9FAFB"/>
             <w:tcMar>
               <w:top w:type="dxa" w:w="80"/>
               <w:left w:type="dxa" w:w="120"/>
@@ -1258,7 +1254,7 @@
         <w:tc>
           <w:tcPr>
             <w:tcW w:type="dxa" w:w="4140"/>
-            <w:shd w:fill="F9FAFB" w:val="clear"/>
+            <w:shd w:val="clear" w:color="auto" w:fill="F9FAFB"/>
             <w:tcMar>
               <w:top w:type="dxa" w:w="80"/>
               <w:left w:type="dxa" w:w="120"/>
@@ -1282,7 +1278,7 @@
         <w:tc>
           <w:tcPr>
             <w:tcW w:type="dxa" w:w="4500"/>
-            <w:shd w:fill="FFFFFF" w:val="clear"/>
+            <w:shd w:val="clear" w:color="auto" w:fill="FFFFFF"/>
             <w:tcMar>
               <w:top w:type="dxa" w:w="80"/>
               <w:left w:type="dxa" w:w="120"/>
@@ -1318,7 +1314,7 @@
         <w:tc>
           <w:tcPr>
             <w:tcW w:type="dxa" w:w="1600"/>
-            <w:shd w:fill="FFFFFF" w:val="clear"/>
+            <w:shd w:val="clear" w:color="auto" w:fill="FFFFFF"/>
             <w:tcMar>
               <w:top w:type="dxa" w:w="80"/>
               <w:left w:type="dxa" w:w="120"/>
@@ -1334,7 +1330,7 @@
                 <w:color w:val="FFFFFF"/>
                 <w:sz w:val="15"/>
                 <w:szCs w:val="15"/>
-                <w:shd w:fill="0891B2" w:val="clear"/>
+                <w:shd w:val="clear" w:color="auto" w:fill="0891B2"/>
               </w:rPr>
               <w:t xml:space="preserve"> ● SOLID </w:t>
             </w:r>
@@ -1343,7 +1339,7 @@
         <w:tc>
           <w:tcPr>
             <w:tcW w:type="dxa" w:w="4000"/>
-            <w:shd w:fill="FFFFFF" w:val="clear"/>
+            <w:shd w:val="clear" w:color="auto" w:fill="FFFFFF"/>
             <w:tcMar>
               <w:top w:type="dxa" w:w="80"/>
               <w:left w:type="dxa" w:w="120"/>
@@ -1365,7 +1361,7 @@
         <w:tc>
           <w:tcPr>
             <w:tcW w:type="dxa" w:w="4140"/>
-            <w:shd w:fill="FFFFFF" w:val="clear"/>
+            <w:shd w:val="clear" w:color="auto" w:fill="FFFFFF"/>
             <w:tcMar>
               <w:top w:type="dxa" w:w="80"/>
               <w:left w:type="dxa" w:w="120"/>
@@ -1389,7 +1385,7 @@
         <w:tc>
           <w:tcPr>
             <w:tcW w:type="dxa" w:w="4500"/>
-            <w:shd w:fill="F9FAFB" w:val="clear"/>
+            <w:shd w:val="clear" w:color="auto" w:fill="F9FAFB"/>
             <w:tcMar>
               <w:top w:type="dxa" w:w="80"/>
               <w:left w:type="dxa" w:w="120"/>
@@ -1425,7 +1421,7 @@
         <w:tc>
           <w:tcPr>
             <w:tcW w:type="dxa" w:w="1600"/>
-            <w:shd w:fill="F9FAFB" w:val="clear"/>
+            <w:shd w:val="clear" w:color="auto" w:fill="F9FAFB"/>
             <w:tcMar>
               <w:top w:type="dxa" w:w="80"/>
               <w:left w:type="dxa" w:w="120"/>
@@ -1441,7 +1437,7 @@
                 <w:color w:val="FFFFFF"/>
                 <w:sz w:val="15"/>
                 <w:szCs w:val="15"/>
-                <w:shd w:fill="D97706" w:val="clear"/>
+                <w:shd w:val="clear" w:color="auto" w:fill="D97706"/>
               </w:rPr>
               <w:t xml:space="preserve"> ▲ THIN </w:t>
             </w:r>
@@ -1450,7 +1446,7 @@
         <w:tc>
           <w:tcPr>
             <w:tcW w:type="dxa" w:w="4000"/>
-            <w:shd w:fill="F9FAFB" w:val="clear"/>
+            <w:shd w:val="clear" w:color="auto" w:fill="F9FAFB"/>
             <w:tcMar>
               <w:top w:type="dxa" w:w="80"/>
               <w:left w:type="dxa" w:w="120"/>
@@ -1472,7 +1468,7 @@
         <w:tc>
           <w:tcPr>
             <w:tcW w:type="dxa" w:w="4140"/>
-            <w:shd w:fill="F9FAFB" w:val="clear"/>
+            <w:shd w:val="clear" w:color="auto" w:fill="F9FAFB"/>
             <w:tcMar>
               <w:top w:type="dxa" w:w="80"/>
               <w:left w:type="dxa" w:w="120"/>
@@ -1496,7 +1492,7 @@
         <w:tc>
           <w:tcPr>
             <w:tcW w:type="dxa" w:w="4500"/>
-            <w:shd w:fill="FFFFFF" w:val="clear"/>
+            <w:shd w:val="clear" w:color="auto" w:fill="FFFFFF"/>
             <w:tcMar>
               <w:top w:type="dxa" w:w="80"/>
               <w:left w:type="dxa" w:w="120"/>
@@ -1532,7 +1528,7 @@
         <w:tc>
           <w:tcPr>
             <w:tcW w:type="dxa" w:w="1600"/>
-            <w:shd w:fill="FFFFFF" w:val="clear"/>
+            <w:shd w:val="clear" w:color="auto" w:fill="FFFFFF"/>
             <w:tcMar>
               <w:top w:type="dxa" w:w="80"/>
               <w:left w:type="dxa" w:w="120"/>
@@ -1548,7 +1544,7 @@
                 <w:color w:val="FFFFFF"/>
                 <w:sz w:val="15"/>
                 <w:szCs w:val="15"/>
-                <w:shd w:fill="0891B2" w:val="clear"/>
+                <w:shd w:val="clear" w:color="auto" w:fill="0891B2"/>
               </w:rPr>
               <w:t xml:space="preserve"> ● SOLID </w:t>
             </w:r>
@@ -1557,7 +1553,7 @@
         <w:tc>
           <w:tcPr>
             <w:tcW w:type="dxa" w:w="4000"/>
-            <w:shd w:fill="FFFFFF" w:val="clear"/>
+            <w:shd w:val="clear" w:color="auto" w:fill="FFFFFF"/>
             <w:tcMar>
               <w:top w:type="dxa" w:w="80"/>
               <w:left w:type="dxa" w:w="120"/>
@@ -1579,7 +1575,7 @@
         <w:tc>
           <w:tcPr>
             <w:tcW w:type="dxa" w:w="4140"/>
-            <w:shd w:fill="FFFFFF" w:val="clear"/>
+            <w:shd w:val="clear" w:color="auto" w:fill="FFFFFF"/>
             <w:tcMar>
               <w:top w:type="dxa" w:w="80"/>
               <w:left w:type="dxa" w:w="120"/>
@@ -1603,7 +1599,7 @@
         <w:tc>
           <w:tcPr>
             <w:tcW w:type="dxa" w:w="4500"/>
-            <w:shd w:fill="F9FAFB" w:val="clear"/>
+            <w:shd w:val="clear" w:color="auto" w:fill="F9FAFB"/>
             <w:tcMar>
               <w:top w:type="dxa" w:w="80"/>
               <w:left w:type="dxa" w:w="120"/>
@@ -1639,7 +1635,7 @@
         <w:tc>
           <w:tcPr>
             <w:tcW w:type="dxa" w:w="1600"/>
-            <w:shd w:fill="F9FAFB" w:val="clear"/>
+            <w:shd w:val="clear" w:color="auto" w:fill="F9FAFB"/>
             <w:tcMar>
               <w:top w:type="dxa" w:w="80"/>
               <w:left w:type="dxa" w:w="120"/>
@@ -1655,7 +1651,7 @@
                 <w:color w:val="FFFFFF"/>
                 <w:sz w:val="15"/>
                 <w:szCs w:val="15"/>
-                <w:shd w:fill="D97706" w:val="clear"/>
+                <w:shd w:val="clear" w:color="auto" w:fill="D97706"/>
               </w:rPr>
               <w:t xml:space="preserve"> ▲ THIN </w:t>
             </w:r>
@@ -1664,7 +1660,7 @@
         <w:tc>
           <w:tcPr>
             <w:tcW w:type="dxa" w:w="4000"/>
-            <w:shd w:fill="F9FAFB" w:val="clear"/>
+            <w:shd w:val="clear" w:color="auto" w:fill="F9FAFB"/>
             <w:tcMar>
               <w:top w:type="dxa" w:w="80"/>
               <w:left w:type="dxa" w:w="120"/>
@@ -1686,7 +1682,7 @@
         <w:tc>
           <w:tcPr>
             <w:tcW w:type="dxa" w:w="4140"/>
-            <w:shd w:fill="F9FAFB" w:val="clear"/>
+            <w:shd w:val="clear" w:color="auto" w:fill="F9FAFB"/>
             <w:tcMar>
               <w:top w:type="dxa" w:w="80"/>
               <w:left w:type="dxa" w:w="120"/>
@@ -1710,7 +1706,7 @@
         <w:tc>
           <w:tcPr>
             <w:tcW w:type="dxa" w:w="4500"/>
-            <w:shd w:fill="FFFFFF" w:val="clear"/>
+            <w:shd w:val="clear" w:color="auto" w:fill="FFFFFF"/>
             <w:tcMar>
               <w:top w:type="dxa" w:w="80"/>
               <w:left w:type="dxa" w:w="120"/>
@@ -1746,7 +1742,7 @@
         <w:tc>
           <w:tcPr>
             <w:tcW w:type="dxa" w:w="1600"/>
-            <w:shd w:fill="FFFFFF" w:val="clear"/>
+            <w:shd w:val="clear" w:color="auto" w:fill="FFFFFF"/>
             <w:tcMar>
               <w:top w:type="dxa" w:w="80"/>
               <w:left w:type="dxa" w:w="120"/>
@@ -1762,7 +1758,7 @@
                 <w:color w:val="FFFFFF"/>
                 <w:sz w:val="15"/>
                 <w:szCs w:val="15"/>
-                <w:shd w:fill="0891B2" w:val="clear"/>
+                <w:shd w:val="clear" w:color="auto" w:fill="0891B2"/>
               </w:rPr>
               <w:t xml:space="preserve"> ● SOLID </w:t>
             </w:r>
@@ -1771,7 +1767,7 @@
         <w:tc>
           <w:tcPr>
             <w:tcW w:type="dxa" w:w="4000"/>
-            <w:shd w:fill="FFFFFF" w:val="clear"/>
+            <w:shd w:val="clear" w:color="auto" w:fill="FFFFFF"/>
             <w:tcMar>
               <w:top w:type="dxa" w:w="80"/>
               <w:left w:type="dxa" w:w="120"/>
@@ -1793,7 +1789,7 @@
         <w:tc>
           <w:tcPr>
             <w:tcW w:type="dxa" w:w="4140"/>
-            <w:shd w:fill="FFFFFF" w:val="clear"/>
+            <w:shd w:val="clear" w:color="auto" w:fill="FFFFFF"/>
             <w:tcMar>
               <w:top w:type="dxa" w:w="80"/>
               <w:left w:type="dxa" w:w="120"/>
@@ -1817,7 +1813,7 @@
         <w:tc>
           <w:tcPr>
             <w:tcW w:type="dxa" w:w="4500"/>
-            <w:shd w:fill="F9FAFB" w:val="clear"/>
+            <w:shd w:val="clear" w:color="auto" w:fill="F9FAFB"/>
             <w:tcMar>
               <w:top w:type="dxa" w:w="80"/>
               <w:left w:type="dxa" w:w="120"/>
@@ -1853,7 +1849,7 @@
         <w:tc>
           <w:tcPr>
             <w:tcW w:type="dxa" w:w="1600"/>
-            <w:shd w:fill="F9FAFB" w:val="clear"/>
+            <w:shd w:val="clear" w:color="auto" w:fill="F9FAFB"/>
             <w:tcMar>
               <w:top w:type="dxa" w:w="80"/>
               <w:left w:type="dxa" w:w="120"/>
@@ -1869,7 +1865,7 @@
                 <w:color w:val="FFFFFF"/>
                 <w:sz w:val="15"/>
                 <w:szCs w:val="15"/>
-                <w:shd w:fill="0891B2" w:val="clear"/>
+                <w:shd w:val="clear" w:color="auto" w:fill="0891B2"/>
               </w:rPr>
               <w:t xml:space="preserve"> ● SOLID </w:t>
             </w:r>
@@ -1878,7 +1874,7 @@
         <w:tc>
           <w:tcPr>
             <w:tcW w:type="dxa" w:w="4000"/>
-            <w:shd w:fill="F9FAFB" w:val="clear"/>
+            <w:shd w:val="clear" w:color="auto" w:fill="F9FAFB"/>
             <w:tcMar>
               <w:top w:type="dxa" w:w="80"/>
               <w:left w:type="dxa" w:w="120"/>
@@ -1900,7 +1896,7 @@
         <w:tc>
           <w:tcPr>
             <w:tcW w:type="dxa" w:w="4140"/>
-            <w:shd w:fill="F9FAFB" w:val="clear"/>
+            <w:shd w:val="clear" w:color="auto" w:fill="F9FAFB"/>
             <w:tcMar>
               <w:top w:type="dxa" w:w="80"/>
               <w:left w:type="dxa" w:w="120"/>
@@ -1924,7 +1920,7 @@
         <w:tc>
           <w:tcPr>
             <w:tcW w:type="dxa" w:w="4500"/>
-            <w:shd w:fill="FFFFFF" w:val="clear"/>
+            <w:shd w:val="clear" w:color="auto" w:fill="FFFFFF"/>
             <w:tcMar>
               <w:top w:type="dxa" w:w="80"/>
               <w:left w:type="dxa" w:w="120"/>
@@ -1960,7 +1956,7 @@
         <w:tc>
           <w:tcPr>
             <w:tcW w:type="dxa" w:w="1600"/>
-            <w:shd w:fill="FFFFFF" w:val="clear"/>
+            <w:shd w:val="clear" w:color="auto" w:fill="FFFFFF"/>
             <w:tcMar>
               <w:top w:type="dxa" w:w="80"/>
               <w:left w:type="dxa" w:w="120"/>
@@ -1976,7 +1972,7 @@
                 <w:color w:val="FFFFFF"/>
                 <w:sz w:val="15"/>
                 <w:szCs w:val="15"/>
-                <w:shd w:fill="0891B2" w:val="clear"/>
+                <w:shd w:val="clear" w:color="auto" w:fill="0891B2"/>
               </w:rPr>
               <w:t xml:space="preserve"> ● SOLID </w:t>
             </w:r>
@@ -1985,7 +1981,7 @@
         <w:tc>
           <w:tcPr>
             <w:tcW w:type="dxa" w:w="4000"/>
-            <w:shd w:fill="FFFFFF" w:val="clear"/>
+            <w:shd w:val="clear" w:color="auto" w:fill="FFFFFF"/>
             <w:tcMar>
               <w:top w:type="dxa" w:w="80"/>
               <w:left w:type="dxa" w:w="120"/>
@@ -2007,7 +2003,7 @@
         <w:tc>
           <w:tcPr>
             <w:tcW w:type="dxa" w:w="4140"/>
-            <w:shd w:fill="FFFFFF" w:val="clear"/>
+            <w:shd w:val="clear" w:color="auto" w:fill="FFFFFF"/>
             <w:tcMar>
               <w:top w:type="dxa" w:w="80"/>
               <w:left w:type="dxa" w:w="120"/>
@@ -2031,7 +2027,7 @@
         <w:tc>
           <w:tcPr>
             <w:tcW w:type="dxa" w:w="4500"/>
-            <w:shd w:fill="F9FAFB" w:val="clear"/>
+            <w:shd w:val="clear" w:color="auto" w:fill="F9FAFB"/>
             <w:tcMar>
               <w:top w:type="dxa" w:w="80"/>
               <w:left w:type="dxa" w:w="120"/>
@@ -2067,7 +2063,7 @@
         <w:tc>
           <w:tcPr>
             <w:tcW w:type="dxa" w:w="1600"/>
-            <w:shd w:fill="F9FAFB" w:val="clear"/>
+            <w:shd w:val="clear" w:color="auto" w:fill="F9FAFB"/>
             <w:tcMar>
               <w:top w:type="dxa" w:w="80"/>
               <w:left w:type="dxa" w:w="120"/>
@@ -2083,7 +2079,7 @@
                 <w:color w:val="FFFFFF"/>
                 <w:sz w:val="15"/>
                 <w:szCs w:val="15"/>
-                <w:shd w:fill="0891B2" w:val="clear"/>
+                <w:shd w:val="clear" w:color="auto" w:fill="0891B2"/>
               </w:rPr>
               <w:t xml:space="preserve"> ● SOLID </w:t>
             </w:r>
@@ -2092,7 +2088,7 @@
         <w:tc>
           <w:tcPr>
             <w:tcW w:type="dxa" w:w="4000"/>
-            <w:shd w:fill="F9FAFB" w:val="clear"/>
+            <w:shd w:val="clear" w:color="auto" w:fill="F9FAFB"/>
             <w:tcMar>
               <w:top w:type="dxa" w:w="80"/>
               <w:left w:type="dxa" w:w="120"/>
@@ -2114,7 +2110,7 @@
         <w:tc>
           <w:tcPr>
             <w:tcW w:type="dxa" w:w="4140"/>
-            <w:shd w:fill="F9FAFB" w:val="clear"/>
+            <w:shd w:val="clear" w:color="auto" w:fill="F9FAFB"/>
             <w:tcMar>
               <w:top w:type="dxa" w:w="80"/>
               <w:left w:type="dxa" w:w="120"/>
@@ -2138,7 +2134,7 @@
         <w:tc>
           <w:tcPr>
             <w:tcW w:type="dxa" w:w="4500"/>
-            <w:shd w:fill="FFFFFF" w:val="clear"/>
+            <w:shd w:val="clear" w:color="auto" w:fill="FFFFFF"/>
             <w:tcMar>
               <w:top w:type="dxa" w:w="80"/>
               <w:left w:type="dxa" w:w="120"/>
@@ -2174,7 +2170,7 @@
         <w:tc>
           <w:tcPr>
             <w:tcW w:type="dxa" w:w="1600"/>
-            <w:shd w:fill="FFFFFF" w:val="clear"/>
+            <w:shd w:val="clear" w:color="auto" w:fill="FFFFFF"/>
             <w:tcMar>
               <w:top w:type="dxa" w:w="80"/>
               <w:left w:type="dxa" w:w="120"/>
@@ -2190,7 +2186,7 @@
                 <w:color w:val="FFFFFF"/>
                 <w:sz w:val="15"/>
                 <w:szCs w:val="15"/>
-                <w:shd w:fill="D97706" w:val="clear"/>
+                <w:shd w:val="clear" w:color="auto" w:fill="D97706"/>
               </w:rPr>
               <w:t xml:space="preserve"> ▲ THIN </w:t>
             </w:r>
@@ -2199,7 +2195,7 @@
         <w:tc>
           <w:tcPr>
             <w:tcW w:type="dxa" w:w="4000"/>
-            <w:shd w:fill="FFFFFF" w:val="clear"/>
+            <w:shd w:val="clear" w:color="auto" w:fill="FFFFFF"/>
             <w:tcMar>
               <w:top w:type="dxa" w:w="80"/>
               <w:left w:type="dxa" w:w="120"/>
@@ -2221,7 +2217,7 @@
         <w:tc>
           <w:tcPr>
             <w:tcW w:type="dxa" w:w="4140"/>
-            <w:shd w:fill="FFFFFF" w:val="clear"/>
+            <w:shd w:val="clear" w:color="auto" w:fill="FFFFFF"/>
             <w:tcMar>
               <w:top w:type="dxa" w:w="80"/>
               <w:left w:type="dxa" w:w="120"/>
@@ -2245,7 +2241,7 @@
         <w:tc>
           <w:tcPr>
             <w:tcW w:type="dxa" w:w="4500"/>
-            <w:shd w:fill="F9FAFB" w:val="clear"/>
+            <w:shd w:val="clear" w:color="auto" w:fill="F9FAFB"/>
             <w:tcMar>
               <w:top w:type="dxa" w:w="80"/>
               <w:left w:type="dxa" w:w="120"/>
@@ -2281,7 +2277,7 @@
         <w:tc>
           <w:tcPr>
             <w:tcW w:type="dxa" w:w="1600"/>
-            <w:shd w:fill="F9FAFB" w:val="clear"/>
+            <w:shd w:val="clear" w:color="auto" w:fill="F9FAFB"/>
             <w:tcMar>
               <w:top w:type="dxa" w:w="80"/>
               <w:left w:type="dxa" w:w="120"/>
@@ -2297,7 +2293,7 @@
                 <w:color w:val="FFFFFF"/>
                 <w:sz w:val="15"/>
                 <w:szCs w:val="15"/>
-                <w:shd w:fill="D97706" w:val="clear"/>
+                <w:shd w:val="clear" w:color="auto" w:fill="D97706"/>
               </w:rPr>
               <w:t xml:space="preserve"> ▲ THIN </w:t>
             </w:r>
@@ -2306,7 +2302,7 @@
         <w:tc>
           <w:tcPr>
             <w:tcW w:type="dxa" w:w="4000"/>
-            <w:shd w:fill="F9FAFB" w:val="clear"/>
+            <w:shd w:val="clear" w:color="auto" w:fill="F9FAFB"/>
             <w:tcMar>
               <w:top w:type="dxa" w:w="80"/>
               <w:left w:type="dxa" w:w="120"/>
@@ -2328,7 +2324,7 @@
         <w:tc>
           <w:tcPr>
             <w:tcW w:type="dxa" w:w="4140"/>
-            <w:shd w:fill="F9FAFB" w:val="clear"/>
+            <w:shd w:val="clear" w:color="auto" w:fill="F9FAFB"/>
             <w:tcMar>
               <w:top w:type="dxa" w:w="80"/>
               <w:left w:type="dxa" w:w="120"/>
@@ -2352,7 +2348,7 @@
         <w:tc>
           <w:tcPr>
             <w:tcW w:type="dxa" w:w="4500"/>
-            <w:shd w:fill="FFFFFF" w:val="clear"/>
+            <w:shd w:val="clear" w:color="auto" w:fill="FFFFFF"/>
             <w:tcMar>
               <w:top w:type="dxa" w:w="80"/>
               <w:left w:type="dxa" w:w="120"/>
@@ -2388,7 +2384,7 @@
         <w:tc>
           <w:tcPr>
             <w:tcW w:type="dxa" w:w="1600"/>
-            <w:shd w:fill="FFFFFF" w:val="clear"/>
+            <w:shd w:val="clear" w:color="auto" w:fill="FFFFFF"/>
             <w:tcMar>
               <w:top w:type="dxa" w:w="80"/>
               <w:left w:type="dxa" w:w="120"/>
@@ -2404,7 +2400,7 @@
                 <w:color w:val="FFFFFF"/>
                 <w:sz w:val="15"/>
                 <w:szCs w:val="15"/>
-                <w:shd w:fill="D97706" w:val="clear"/>
+                <w:shd w:val="clear" w:color="auto" w:fill="D97706"/>
               </w:rPr>
               <w:t xml:space="preserve"> ▲ THIN </w:t>
             </w:r>
@@ -2413,7 +2409,7 @@
         <w:tc>
           <w:tcPr>
             <w:tcW w:type="dxa" w:w="4000"/>
-            <w:shd w:fill="FFFFFF" w:val="clear"/>
+            <w:shd w:val="clear" w:color="auto" w:fill="FFFFFF"/>
             <w:tcMar>
               <w:top w:type="dxa" w:w="80"/>
               <w:left w:type="dxa" w:w="120"/>
@@ -2435,7 +2431,7 @@
         <w:tc>
           <w:tcPr>
             <w:tcW w:type="dxa" w:w="4140"/>
-            <w:shd w:fill="FFFFFF" w:val="clear"/>
+            <w:shd w:val="clear" w:color="auto" w:fill="FFFFFF"/>
             <w:tcMar>
               <w:top w:type="dxa" w:w="80"/>
               <w:left w:type="dxa" w:w="120"/>
@@ -2459,7 +2455,7 @@
         <w:tc>
           <w:tcPr>
             <w:tcW w:type="dxa" w:w="4500"/>
-            <w:shd w:fill="F9FAFB" w:val="clear"/>
+            <w:shd w:val="clear" w:color="auto" w:fill="F9FAFB"/>
             <w:tcMar>
               <w:top w:type="dxa" w:w="80"/>
               <w:left w:type="dxa" w:w="120"/>
@@ -2495,7 +2491,7 @@
         <w:tc>
           <w:tcPr>
             <w:tcW w:type="dxa" w:w="1600"/>
-            <w:shd w:fill="F9FAFB" w:val="clear"/>
+            <w:shd w:val="clear" w:color="auto" w:fill="F9FAFB"/>
             <w:tcMar>
               <w:top w:type="dxa" w:w="80"/>
               <w:left w:type="dxa" w:w="120"/>
@@ -2511,7 +2507,7 @@
                 <w:color w:val="FFFFFF"/>
                 <w:sz w:val="15"/>
                 <w:szCs w:val="15"/>
-                <w:shd w:fill="D97706" w:val="clear"/>
+                <w:shd w:val="clear" w:color="auto" w:fill="D97706"/>
               </w:rPr>
               <w:t xml:space="preserve"> ▲ THIN </w:t>
             </w:r>
@@ -2520,7 +2516,7 @@
         <w:tc>
           <w:tcPr>
             <w:tcW w:type="dxa" w:w="4000"/>
-            <w:shd w:fill="F9FAFB" w:val="clear"/>
+            <w:shd w:val="clear" w:color="auto" w:fill="F9FAFB"/>
             <w:tcMar>
               <w:top w:type="dxa" w:w="80"/>
               <w:left w:type="dxa" w:w="120"/>
@@ -2542,7 +2538,7 @@
         <w:tc>
           <w:tcPr>
             <w:tcW w:type="dxa" w:w="4140"/>
-            <w:shd w:fill="F9FAFB" w:val="clear"/>
+            <w:shd w:val="clear" w:color="auto" w:fill="F9FAFB"/>
             <w:tcMar>
               <w:top w:type="dxa" w:w="80"/>
               <w:left w:type="dxa" w:w="120"/>
@@ -2566,7 +2562,7 @@
         <w:tc>
           <w:tcPr>
             <w:tcW w:type="dxa" w:w="4500"/>
-            <w:shd w:fill="FFFFFF" w:val="clear"/>
+            <w:shd w:val="clear" w:color="auto" w:fill="FFFFFF"/>
             <w:tcMar>
               <w:top w:type="dxa" w:w="80"/>
               <w:left w:type="dxa" w:w="120"/>
@@ -2602,7 +2598,7 @@
         <w:tc>
           <w:tcPr>
             <w:tcW w:type="dxa" w:w="1600"/>
-            <w:shd w:fill="FFFFFF" w:val="clear"/>
+            <w:shd w:val="clear" w:color="auto" w:fill="FFFFFF"/>
             <w:tcMar>
               <w:top w:type="dxa" w:w="80"/>
               <w:left w:type="dxa" w:w="120"/>
@@ -2618,7 +2614,7 @@
                 <w:color w:val="FFFFFF"/>
                 <w:sz w:val="15"/>
                 <w:szCs w:val="15"/>
-                <w:shd w:fill="D97706" w:val="clear"/>
+                <w:shd w:val="clear" w:color="auto" w:fill="D97706"/>
               </w:rPr>
               <w:t xml:space="preserve"> ▲ THIN </w:t>
             </w:r>
@@ -2627,7 +2623,7 @@
         <w:tc>
           <w:tcPr>
             <w:tcW w:type="dxa" w:w="4000"/>
-            <w:shd w:fill="FFFFFF" w:val="clear"/>
+            <w:shd w:val="clear" w:color="auto" w:fill="FFFFFF"/>
             <w:tcMar>
               <w:top w:type="dxa" w:w="80"/>
               <w:left w:type="dxa" w:w="120"/>
@@ -2649,7 +2645,7 @@
         <w:tc>
           <w:tcPr>
             <w:tcW w:type="dxa" w:w="4140"/>
-            <w:shd w:fill="FFFFFF" w:val="clear"/>
+            <w:shd w:val="clear" w:color="auto" w:fill="FFFFFF"/>
             <w:tcMar>
               <w:top w:type="dxa" w:w="80"/>
               <w:left w:type="dxa" w:w="120"/>
@@ -2673,7 +2669,7 @@
         <w:tc>
           <w:tcPr>
             <w:tcW w:type="dxa" w:w="4500"/>
-            <w:shd w:fill="F9FAFB" w:val="clear"/>
+            <w:shd w:val="clear" w:color="auto" w:fill="F9FAFB"/>
             <w:tcMar>
               <w:top w:type="dxa" w:w="80"/>
               <w:left w:type="dxa" w:w="120"/>
@@ -2709,7 +2705,7 @@
         <w:tc>
           <w:tcPr>
             <w:tcW w:type="dxa" w:w="1600"/>
-            <w:shd w:fill="F9FAFB" w:val="clear"/>
+            <w:shd w:val="clear" w:color="auto" w:fill="F9FAFB"/>
             <w:tcMar>
               <w:top w:type="dxa" w:w="80"/>
               <w:left w:type="dxa" w:w="120"/>
@@ -2725,7 +2721,7 @@
                 <w:color w:val="FFFFFF"/>
                 <w:sz w:val="15"/>
                 <w:szCs w:val="15"/>
-                <w:shd w:fill="D97706" w:val="clear"/>
+                <w:shd w:val="clear" w:color="auto" w:fill="D97706"/>
               </w:rPr>
               <w:t xml:space="preserve"> ▲ THIN </w:t>
             </w:r>
@@ -2734,7 +2730,7 @@
         <w:tc>
           <w:tcPr>
             <w:tcW w:type="dxa" w:w="4000"/>
-            <w:shd w:fill="F9FAFB" w:val="clear"/>
+            <w:shd w:val="clear" w:color="auto" w:fill="F9FAFB"/>
             <w:tcMar>
               <w:top w:type="dxa" w:w="80"/>
               <w:left w:type="dxa" w:w="120"/>
@@ -2756,7 +2752,7 @@
         <w:tc>
           <w:tcPr>
             <w:tcW w:type="dxa" w:w="4140"/>
-            <w:shd w:fill="F9FAFB" w:val="clear"/>
+            <w:shd w:val="clear" w:color="auto" w:fill="F9FAFB"/>
             <w:tcMar>
               <w:top w:type="dxa" w:w="80"/>
               <w:left w:type="dxa" w:w="120"/>
@@ -2780,7 +2776,7 @@
         <w:tc>
           <w:tcPr>
             <w:tcW w:type="dxa" w:w="4500"/>
-            <w:shd w:fill="FFFFFF" w:val="clear"/>
+            <w:shd w:val="clear" w:color="auto" w:fill="FFFFFF"/>
             <w:tcMar>
               <w:top w:type="dxa" w:w="80"/>
               <w:left w:type="dxa" w:w="120"/>
@@ -2816,7 +2812,7 @@
         <w:tc>
           <w:tcPr>
             <w:tcW w:type="dxa" w:w="1600"/>
-            <w:shd w:fill="FFFFFF" w:val="clear"/>
+            <w:shd w:val="clear" w:color="auto" w:fill="FFFFFF"/>
             <w:tcMar>
               <w:top w:type="dxa" w:w="80"/>
               <w:left w:type="dxa" w:w="120"/>
@@ -2832,7 +2828,7 @@
                 <w:color w:val="FFFFFF"/>
                 <w:sz w:val="15"/>
                 <w:szCs w:val="15"/>
-                <w:shd w:fill="D97706" w:val="clear"/>
+                <w:shd w:val="clear" w:color="auto" w:fill="D97706"/>
               </w:rPr>
               <w:t xml:space="preserve"> ▲ THIN </w:t>
             </w:r>
@@ -2841,7 +2837,7 @@
         <w:tc>
           <w:tcPr>
             <w:tcW w:type="dxa" w:w="4000"/>
-            <w:shd w:fill="FFFFFF" w:val="clear"/>
+            <w:shd w:val="clear" w:color="auto" w:fill="FFFFFF"/>
             <w:tcMar>
               <w:top w:type="dxa" w:w="80"/>
               <w:left w:type="dxa" w:w="120"/>
@@ -2863,7 +2859,7 @@
         <w:tc>
           <w:tcPr>
             <w:tcW w:type="dxa" w:w="4140"/>
-            <w:shd w:fill="FFFFFF" w:val="clear"/>
+            <w:shd w:val="clear" w:color="auto" w:fill="FFFFFF"/>
             <w:tcMar>
               <w:top w:type="dxa" w:w="80"/>
               <w:left w:type="dxa" w:w="120"/>
@@ -2887,7 +2883,7 @@
         <w:tc>
           <w:tcPr>
             <w:tcW w:type="dxa" w:w="4500"/>
-            <w:shd w:fill="F9FAFB" w:val="clear"/>
+            <w:shd w:val="clear" w:color="auto" w:fill="F9FAFB"/>
             <w:tcMar>
               <w:top w:type="dxa" w:w="80"/>
               <w:left w:type="dxa" w:w="120"/>
@@ -2923,7 +2919,7 @@
         <w:tc>
           <w:tcPr>
             <w:tcW w:type="dxa" w:w="1600"/>
-            <w:shd w:fill="F9FAFB" w:val="clear"/>
+            <w:shd w:val="clear" w:color="auto" w:fill="F9FAFB"/>
             <w:tcMar>
               <w:top w:type="dxa" w:w="80"/>
               <w:left w:type="dxa" w:w="120"/>
@@ -2939,7 +2935,7 @@
                 <w:color w:val="FFFFFF"/>
                 <w:sz w:val="15"/>
                 <w:szCs w:val="15"/>
-                <w:shd w:fill="0891B2" w:val="clear"/>
+                <w:shd w:val="clear" w:color="auto" w:fill="0891B2"/>
               </w:rPr>
               <w:t xml:space="preserve"> ● SOLID </w:t>
             </w:r>
@@ -2948,7 +2944,7 @@
         <w:tc>
           <w:tcPr>
             <w:tcW w:type="dxa" w:w="4000"/>
-            <w:shd w:fill="F9FAFB" w:val="clear"/>
+            <w:shd w:val="clear" w:color="auto" w:fill="F9FAFB"/>
             <w:tcMar>
               <w:top w:type="dxa" w:w="80"/>
               <w:left w:type="dxa" w:w="120"/>
@@ -2970,7 +2966,7 @@
         <w:tc>
           <w:tcPr>
             <w:tcW w:type="dxa" w:w="4140"/>
-            <w:shd w:fill="F9FAFB" w:val="clear"/>
+            <w:shd w:val="clear" w:color="auto" w:fill="F9FAFB"/>
             <w:tcMar>
               <w:top w:type="dxa" w:w="80"/>
               <w:left w:type="dxa" w:w="120"/>
@@ -2994,7 +2990,7 @@
         <w:tc>
           <w:tcPr>
             <w:tcW w:type="dxa" w:w="4500"/>
-            <w:shd w:fill="FFFFFF" w:val="clear"/>
+            <w:shd w:val="clear" w:color="auto" w:fill="FFFFFF"/>
             <w:tcMar>
               <w:top w:type="dxa" w:w="80"/>
               <w:left w:type="dxa" w:w="120"/>
@@ -3030,7 +3026,7 @@
         <w:tc>
           <w:tcPr>
             <w:tcW w:type="dxa" w:w="1600"/>
-            <w:shd w:fill="FFFFFF" w:val="clear"/>
+            <w:shd w:val="clear" w:color="auto" w:fill="FFFFFF"/>
             <w:tcMar>
               <w:top w:type="dxa" w:w="80"/>
               <w:left w:type="dxa" w:w="120"/>
@@ -3046,7 +3042,7 @@
                 <w:color w:val="FFFFFF"/>
                 <w:sz w:val="15"/>
                 <w:szCs w:val="15"/>
-                <w:shd w:fill="0891B2" w:val="clear"/>
+                <w:shd w:val="clear" w:color="auto" w:fill="0891B2"/>
               </w:rPr>
               <w:t xml:space="preserve"> ● SOLID </w:t>
             </w:r>
@@ -3055,7 +3051,7 @@
         <w:tc>
           <w:tcPr>
             <w:tcW w:type="dxa" w:w="4000"/>
-            <w:shd w:fill="FFFFFF" w:val="clear"/>
+            <w:shd w:val="clear" w:color="auto" w:fill="FFFFFF"/>
             <w:tcMar>
               <w:top w:type="dxa" w:w="80"/>
               <w:left w:type="dxa" w:w="120"/>
@@ -3077,7 +3073,7 @@
         <w:tc>
           <w:tcPr>
             <w:tcW w:type="dxa" w:w="4140"/>
-            <w:shd w:fill="FFFFFF" w:val="clear"/>
+            <w:shd w:val="clear" w:color="auto" w:fill="FFFFFF"/>
             <w:tcMar>
               <w:top w:type="dxa" w:w="80"/>
               <w:left w:type="dxa" w:w="120"/>
@@ -3101,7 +3097,7 @@
         <w:tc>
           <w:tcPr>
             <w:tcW w:type="dxa" w:w="4500"/>
-            <w:shd w:fill="F9FAFB" w:val="clear"/>
+            <w:shd w:val="clear" w:color="auto" w:fill="F9FAFB"/>
             <w:tcMar>
               <w:top w:type="dxa" w:w="80"/>
               <w:left w:type="dxa" w:w="120"/>
@@ -3137,7 +3133,7 @@
         <w:tc>
           <w:tcPr>
             <w:tcW w:type="dxa" w:w="1600"/>
-            <w:shd w:fill="F9FAFB" w:val="clear"/>
+            <w:shd w:val="clear" w:color="auto" w:fill="F9FAFB"/>
             <w:tcMar>
               <w:top w:type="dxa" w:w="80"/>
               <w:left w:type="dxa" w:w="120"/>
@@ -3153,7 +3149,7 @@
                 <w:color w:val="FFFFFF"/>
                 <w:sz w:val="15"/>
                 <w:szCs w:val="15"/>
-                <w:shd w:fill="059669" w:val="clear"/>
+                <w:shd w:val="clear" w:color="auto" w:fill="059669"/>
               </w:rPr>
               <w:t xml:space="preserve"> ✓ COMPLETE </w:t>
             </w:r>
@@ -3162,7 +3158,7 @@
         <w:tc>
           <w:tcPr>
             <w:tcW w:type="dxa" w:w="4000"/>
-            <w:shd w:fill="F9FAFB" w:val="clear"/>
+            <w:shd w:val="clear" w:color="auto" w:fill="F9FAFB"/>
             <w:tcMar>
               <w:top w:type="dxa" w:w="80"/>
               <w:left w:type="dxa" w:w="120"/>
@@ -3184,7 +3180,7 @@
         <w:tc>
           <w:tcPr>
             <w:tcW w:type="dxa" w:w="4140"/>
-            <w:shd w:fill="F9FAFB" w:val="clear"/>
+            <w:shd w:val="clear" w:color="auto" w:fill="F9FAFB"/>
             <w:tcMar>
               <w:top w:type="dxa" w:w="80"/>
               <w:left w:type="dxa" w:w="120"/>
@@ -3208,7 +3204,7 @@
         <w:tc>
           <w:tcPr>
             <w:tcW w:type="dxa" w:w="4500"/>
-            <w:shd w:fill="FFFFFF" w:val="clear"/>
+            <w:shd w:val="clear" w:color="auto" w:fill="FFFFFF"/>
             <w:tcMar>
               <w:top w:type="dxa" w:w="80"/>
               <w:left w:type="dxa" w:w="120"/>
@@ -3244,7 +3240,7 @@
         <w:tc>
           <w:tcPr>
             <w:tcW w:type="dxa" w:w="1600"/>
-            <w:shd w:fill="FFFFFF" w:val="clear"/>
+            <w:shd w:val="clear" w:color="auto" w:fill="FFFFFF"/>
             <w:tcMar>
               <w:top w:type="dxa" w:w="80"/>
               <w:left w:type="dxa" w:w="120"/>
@@ -3260,7 +3256,7 @@
                 <w:color w:val="FFFFFF"/>
                 <w:sz w:val="15"/>
                 <w:szCs w:val="15"/>
-                <w:shd w:fill="0891B2" w:val="clear"/>
+                <w:shd w:val="clear" w:color="auto" w:fill="0891B2"/>
               </w:rPr>
               <w:t xml:space="preserve"> ● SOLID </w:t>
             </w:r>
@@ -3269,7 +3265,7 @@
         <w:tc>
           <w:tcPr>
             <w:tcW w:type="dxa" w:w="4000"/>
-            <w:shd w:fill="FFFFFF" w:val="clear"/>
+            <w:shd w:val="clear" w:color="auto" w:fill="FFFFFF"/>
             <w:tcMar>
               <w:top w:type="dxa" w:w="80"/>
               <w:left w:type="dxa" w:w="120"/>
@@ -3291,7 +3287,7 @@
         <w:tc>
           <w:tcPr>
             <w:tcW w:type="dxa" w:w="4140"/>
-            <w:shd w:fill="FFFFFF" w:val="clear"/>
+            <w:shd w:val="clear" w:color="auto" w:fill="FFFFFF"/>
             <w:tcMar>
               <w:top w:type="dxa" w:w="80"/>
               <w:left w:type="dxa" w:w="120"/>
@@ -3315,7 +3311,7 @@
         <w:tc>
           <w:tcPr>
             <w:tcW w:type="dxa" w:w="4500"/>
-            <w:shd w:fill="F9FAFB" w:val="clear"/>
+            <w:shd w:val="clear" w:color="auto" w:fill="F9FAFB"/>
             <w:tcMar>
               <w:top w:type="dxa" w:w="80"/>
               <w:left w:type="dxa" w:w="120"/>
@@ -3351,7 +3347,7 @@
         <w:tc>
           <w:tcPr>
             <w:tcW w:type="dxa" w:w="1600"/>
-            <w:shd w:fill="F9FAFB" w:val="clear"/>
+            <w:shd w:val="clear" w:color="auto" w:fill="F9FAFB"/>
             <w:tcMar>
               <w:top w:type="dxa" w:w="80"/>
               <w:left w:type="dxa" w:w="120"/>
@@ -3367,7 +3363,7 @@
                 <w:color w:val="FFFFFF"/>
                 <w:sz w:val="15"/>
                 <w:szCs w:val="15"/>
-                <w:shd w:fill="0891B2" w:val="clear"/>
+                <w:shd w:val="clear" w:color="auto" w:fill="0891B2"/>
               </w:rPr>
               <w:t xml:space="preserve"> ● SOLID </w:t>
             </w:r>
@@ -3376,7 +3372,7 @@
         <w:tc>
           <w:tcPr>
             <w:tcW w:type="dxa" w:w="4000"/>
-            <w:shd w:fill="F9FAFB" w:val="clear"/>
+            <w:shd w:val="clear" w:color="auto" w:fill="F9FAFB"/>
             <w:tcMar>
               <w:top w:type="dxa" w:w="80"/>
               <w:left w:type="dxa" w:w="120"/>
@@ -3398,7 +3394,7 @@
         <w:tc>
           <w:tcPr>
             <w:tcW w:type="dxa" w:w="4140"/>
-            <w:shd w:fill="F9FAFB" w:val="clear"/>
+            <w:shd w:val="clear" w:color="auto" w:fill="F9FAFB"/>
             <w:tcMar>
               <w:top w:type="dxa" w:w="80"/>
               <w:left w:type="dxa" w:w="120"/>
@@ -3422,7 +3418,7 @@
         <w:tc>
           <w:tcPr>
             <w:tcW w:type="dxa" w:w="4500"/>
-            <w:shd w:fill="FFFFFF" w:val="clear"/>
+            <w:shd w:val="clear" w:color="auto" w:fill="FFFFFF"/>
             <w:tcMar>
               <w:top w:type="dxa" w:w="80"/>
               <w:left w:type="dxa" w:w="120"/>
@@ -3458,7 +3454,7 @@
         <w:tc>
           <w:tcPr>
             <w:tcW w:type="dxa" w:w="1600"/>
-            <w:shd w:fill="FFFFFF" w:val="clear"/>
+            <w:shd w:val="clear" w:color="auto" w:fill="FFFFFF"/>
             <w:tcMar>
               <w:top w:type="dxa" w:w="80"/>
               <w:left w:type="dxa" w:w="120"/>
@@ -3474,7 +3470,7 @@
                 <w:color w:val="FFFFFF"/>
                 <w:sz w:val="15"/>
                 <w:szCs w:val="15"/>
-                <w:shd w:fill="0891B2" w:val="clear"/>
+                <w:shd w:val="clear" w:color="auto" w:fill="0891B2"/>
               </w:rPr>
               <w:t xml:space="preserve"> ● SOLID </w:t>
             </w:r>
@@ -3483,7 +3479,7 @@
         <w:tc>
           <w:tcPr>
             <w:tcW w:type="dxa" w:w="4000"/>
-            <w:shd w:fill="FFFFFF" w:val="clear"/>
+            <w:shd w:val="clear" w:color="auto" w:fill="FFFFFF"/>
             <w:tcMar>
               <w:top w:type="dxa" w:w="80"/>
               <w:left w:type="dxa" w:w="120"/>
@@ -3505,7 +3501,7 @@
         <w:tc>
           <w:tcPr>
             <w:tcW w:type="dxa" w:w="4140"/>
-            <w:shd w:fill="FFFFFF" w:val="clear"/>
+            <w:shd w:val="clear" w:color="auto" w:fill="FFFFFF"/>
             <w:tcMar>
               <w:top w:type="dxa" w:w="80"/>
               <w:left w:type="dxa" w:w="120"/>
@@ -3529,7 +3525,7 @@
         <w:tc>
           <w:tcPr>
             <w:tcW w:type="dxa" w:w="4500"/>
-            <w:shd w:fill="F9FAFB" w:val="clear"/>
+            <w:shd w:val="clear" w:color="auto" w:fill="F9FAFB"/>
             <w:tcMar>
               <w:top w:type="dxa" w:w="80"/>
               <w:left w:type="dxa" w:w="120"/>
@@ -3565,7 +3561,7 @@
         <w:tc>
           <w:tcPr>
             <w:tcW w:type="dxa" w:w="1600"/>
-            <w:shd w:fill="F9FAFB" w:val="clear"/>
+            <w:shd w:val="clear" w:color="auto" w:fill="F9FAFB"/>
             <w:tcMar>
               <w:top w:type="dxa" w:w="80"/>
               <w:left w:type="dxa" w:w="120"/>
@@ -3581,7 +3577,7 @@
                 <w:color w:val="FFFFFF"/>
                 <w:sz w:val="15"/>
                 <w:szCs w:val="15"/>
-                <w:shd w:fill="D97706" w:val="clear"/>
+                <w:shd w:val="clear" w:color="auto" w:fill="D97706"/>
               </w:rPr>
               <w:t xml:space="preserve"> ▲ THIN </w:t>
             </w:r>
@@ -3590,7 +3586,7 @@
         <w:tc>
           <w:tcPr>
             <w:tcW w:type="dxa" w:w="4000"/>
-            <w:shd w:fill="F9FAFB" w:val="clear"/>
+            <w:shd w:val="clear" w:color="auto" w:fill="F9FAFB"/>
             <w:tcMar>
               <w:top w:type="dxa" w:w="80"/>
               <w:left w:type="dxa" w:w="120"/>
@@ -3612,7 +3608,7 @@
         <w:tc>
           <w:tcPr>
             <w:tcW w:type="dxa" w:w="4140"/>
-            <w:shd w:fill="F9FAFB" w:val="clear"/>
+            <w:shd w:val="clear" w:color="auto" w:fill="F9FAFB"/>
             <w:tcMar>
               <w:top w:type="dxa" w:w="80"/>
               <w:left w:type="dxa" w:w="120"/>
@@ -3720,7 +3716,7 @@
         <w:tc>
           <w:tcPr>
             <w:tcW w:type="dxa" w:w="500"/>
-            <w:shd w:fill="7C3AED" w:val="clear"/>
+            <w:shd w:val="clear" w:color="auto" w:fill="7C3AED"/>
             <w:tcMar>
               <w:top w:type="dxa" w:w="80"/>
               <w:left w:type="dxa" w:w="120"/>
@@ -3744,7 +3740,7 @@
         <w:tc>
           <w:tcPr>
             <w:tcW w:type="dxa" w:w="4000"/>
-            <w:shd w:fill="7C3AED" w:val="clear"/>
+            <w:shd w:val="clear" w:color="auto" w:fill="7C3AED"/>
             <w:tcMar>
               <w:top w:type="dxa" w:w="80"/>
               <w:left w:type="dxa" w:w="120"/>
@@ -3768,7 +3764,7 @@
         <w:tc>
           <w:tcPr>
             <w:tcW w:type="dxa" w:w="2000"/>
-            <w:shd w:fill="7C3AED" w:val="clear"/>
+            <w:shd w:val="clear" w:color="auto" w:fill="7C3AED"/>
             <w:tcMar>
               <w:top w:type="dxa" w:w="80"/>
               <w:left w:type="dxa" w:w="120"/>
@@ -3792,7 +3788,7 @@
         <w:tc>
           <w:tcPr>
             <w:tcW w:type="dxa" w:w="1500"/>
-            <w:shd w:fill="7C3AED" w:val="clear"/>
+            <w:shd w:val="clear" w:color="auto" w:fill="7C3AED"/>
             <w:tcMar>
               <w:top w:type="dxa" w:w="80"/>
               <w:left w:type="dxa" w:w="120"/>
@@ -3816,7 +3812,7 @@
         <w:tc>
           <w:tcPr>
             <w:tcW w:type="dxa" w:w="6240"/>
-            <w:shd w:fill="7C3AED" w:val="clear"/>
+            <w:shd w:val="clear" w:color="auto" w:fill="7C3AED"/>
             <w:tcMar>
               <w:top w:type="dxa" w:w="80"/>
               <w:left w:type="dxa" w:w="120"/>
@@ -3842,7 +3838,7 @@
         <w:tc>
           <w:tcPr>
             <w:tcW w:type="dxa" w:w="500"/>
-            <w:shd w:fill="F5F3FF" w:val="clear"/>
+            <w:shd w:val="clear" w:color="auto" w:fill="F5F3FF"/>
             <w:tcMar>
               <w:top w:type="dxa" w:w="80"/>
               <w:left w:type="dxa" w:w="120"/>
@@ -3866,7 +3862,7 @@
         <w:tc>
           <w:tcPr>
             <w:tcW w:type="dxa" w:w="4000"/>
-            <w:shd w:fill="F5F3FF" w:val="clear"/>
+            <w:shd w:val="clear" w:color="auto" w:fill="F5F3FF"/>
             <w:tcMar>
               <w:top w:type="dxa" w:w="80"/>
               <w:left w:type="dxa" w:w="120"/>
@@ -3890,7 +3886,7 @@
         <w:tc>
           <w:tcPr>
             <w:tcW w:type="dxa" w:w="2000"/>
-            <w:shd w:fill="F5F3FF" w:val="clear"/>
+            <w:shd w:val="clear" w:color="auto" w:fill="F5F3FF"/>
             <w:tcMar>
               <w:top w:type="dxa" w:w="80"/>
               <w:left w:type="dxa" w:w="120"/>
@@ -3912,7 +3908,7 @@
         <w:tc>
           <w:tcPr>
             <w:tcW w:type="dxa" w:w="1500"/>
-            <w:shd w:fill="F5F3FF" w:val="clear"/>
+            <w:shd w:val="clear" w:color="auto" w:fill="F5F3FF"/>
             <w:tcMar>
               <w:top w:type="dxa" w:w="80"/>
               <w:left w:type="dxa" w:w="120"/>
@@ -3928,7 +3924,7 @@
                 <w:color w:val="FFFFFF"/>
                 <w:sz w:val="16"/>
                 <w:szCs w:val="16"/>
-                <w:shd w:fill="DC2626" w:val="clear"/>
+                <w:shd w:val="clear" w:color="auto" w:fill="DC2626"/>
               </w:rPr>
               <w:t xml:space="preserve"> HIGH </w:t>
             </w:r>
@@ -3937,7 +3933,7 @@
         <w:tc>
           <w:tcPr>
             <w:tcW w:type="dxa" w:w="6240"/>
-            <w:shd w:fill="F5F3FF" w:val="clear"/>
+            <w:shd w:val="clear" w:color="auto" w:fill="F5F3FF"/>
             <w:tcMar>
               <w:top w:type="dxa" w:w="80"/>
               <w:left w:type="dxa" w:w="120"/>
@@ -3961,7 +3957,7 @@
         <w:tc>
           <w:tcPr>
             <w:tcW w:type="dxa" w:w="500"/>
-            <w:shd w:fill="FFFFFF" w:val="clear"/>
+            <w:shd w:val="clear" w:color="auto" w:fill="FFFFFF"/>
             <w:tcMar>
               <w:top w:type="dxa" w:w="80"/>
               <w:left w:type="dxa" w:w="120"/>
@@ -3985,7 +3981,7 @@
         <w:tc>
           <w:tcPr>
             <w:tcW w:type="dxa" w:w="4000"/>
-            <w:shd w:fill="FFFFFF" w:val="clear"/>
+            <w:shd w:val="clear" w:color="auto" w:fill="FFFFFF"/>
             <w:tcMar>
               <w:top w:type="dxa" w:w="80"/>
               <w:left w:type="dxa" w:w="120"/>
@@ -4009,7 +4005,7 @@
         <w:tc>
           <w:tcPr>
             <w:tcW w:type="dxa" w:w="2000"/>
-            <w:shd w:fill="FFFFFF" w:val="clear"/>
+            <w:shd w:val="clear" w:color="auto" w:fill="FFFFFF"/>
             <w:tcMar>
               <w:top w:type="dxa" w:w="80"/>
               <w:left w:type="dxa" w:w="120"/>
@@ -4031,7 +4027,7 @@
         <w:tc>
           <w:tcPr>
             <w:tcW w:type="dxa" w:w="1500"/>
-            <w:shd w:fill="FFFFFF" w:val="clear"/>
+            <w:shd w:val="clear" w:color="auto" w:fill="FFFFFF"/>
             <w:tcMar>
               <w:top w:type="dxa" w:w="80"/>
               <w:left w:type="dxa" w:w="120"/>
@@ -4047,7 +4043,7 @@
                 <w:color w:val="FFFFFF"/>
                 <w:sz w:val="16"/>
                 <w:szCs w:val="16"/>
-                <w:shd w:fill="DC2626" w:val="clear"/>
+                <w:shd w:val="clear" w:color="auto" w:fill="DC2626"/>
               </w:rPr>
               <w:t xml:space="preserve"> HIGH </w:t>
             </w:r>
@@ -4056,7 +4052,7 @@
         <w:tc>
           <w:tcPr>
             <w:tcW w:type="dxa" w:w="6240"/>
-            <w:shd w:fill="FFFFFF" w:val="clear"/>
+            <w:shd w:val="clear" w:color="auto" w:fill="FFFFFF"/>
             <w:tcMar>
               <w:top w:type="dxa" w:w="80"/>
               <w:left w:type="dxa" w:w="120"/>
@@ -4080,7 +4076,7 @@
         <w:tc>
           <w:tcPr>
             <w:tcW w:type="dxa" w:w="500"/>
-            <w:shd w:fill="F5F3FF" w:val="clear"/>
+            <w:shd w:val="clear" w:color="auto" w:fill="F5F3FF"/>
             <w:tcMar>
               <w:top w:type="dxa" w:w="80"/>
               <w:left w:type="dxa" w:w="120"/>
@@ -4104,7 +4100,7 @@
         <w:tc>
           <w:tcPr>
             <w:tcW w:type="dxa" w:w="4000"/>
-            <w:shd w:fill="F5F3FF" w:val="clear"/>
+            <w:shd w:val="clear" w:color="auto" w:fill="F5F3FF"/>
             <w:tcMar>
               <w:top w:type="dxa" w:w="80"/>
               <w:left w:type="dxa" w:w="120"/>
@@ -4128,7 +4124,7 @@
         <w:tc>
           <w:tcPr>
             <w:tcW w:type="dxa" w:w="2000"/>
-            <w:shd w:fill="F5F3FF" w:val="clear"/>
+            <w:shd w:val="clear" w:color="auto" w:fill="F5F3FF"/>
             <w:tcMar>
               <w:top w:type="dxa" w:w="80"/>
               <w:left w:type="dxa" w:w="120"/>
@@ -4150,7 +4146,7 @@
         <w:tc>
           <w:tcPr>
             <w:tcW w:type="dxa" w:w="1500"/>
-            <w:shd w:fill="F5F3FF" w:val="clear"/>
+            <w:shd w:val="clear" w:color="auto" w:fill="F5F3FF"/>
             <w:tcMar>
               <w:top w:type="dxa" w:w="80"/>
               <w:left w:type="dxa" w:w="120"/>
@@ -4166,7 +4162,7 @@
                 <w:color w:val="FFFFFF"/>
                 <w:sz w:val="16"/>
                 <w:szCs w:val="16"/>
-                <w:shd w:fill="DC2626" w:val="clear"/>
+                <w:shd w:val="clear" w:color="auto" w:fill="DC2626"/>
               </w:rPr>
               <w:t xml:space="preserve"> HIGH </w:t>
             </w:r>
@@ -4175,7 +4171,7 @@
         <w:tc>
           <w:tcPr>
             <w:tcW w:type="dxa" w:w="6240"/>
-            <w:shd w:fill="F5F3FF" w:val="clear"/>
+            <w:shd w:val="clear" w:color="auto" w:fill="F5F3FF"/>
             <w:tcMar>
               <w:top w:type="dxa" w:w="80"/>
               <w:left w:type="dxa" w:w="120"/>
@@ -4199,7 +4195,7 @@
         <w:tc>
           <w:tcPr>
             <w:tcW w:type="dxa" w:w="500"/>
-            <w:shd w:fill="FFFFFF" w:val="clear"/>
+            <w:shd w:val="clear" w:color="auto" w:fill="FFFFFF"/>
             <w:tcMar>
               <w:top w:type="dxa" w:w="80"/>
               <w:left w:type="dxa" w:w="120"/>
@@ -4223,7 +4219,7 @@
         <w:tc>
           <w:tcPr>
             <w:tcW w:type="dxa" w:w="4000"/>
-            <w:shd w:fill="FFFFFF" w:val="clear"/>
+            <w:shd w:val="clear" w:color="auto" w:fill="FFFFFF"/>
             <w:tcMar>
               <w:top w:type="dxa" w:w="80"/>
               <w:left w:type="dxa" w:w="120"/>
@@ -4247,7 +4243,7 @@
         <w:tc>
           <w:tcPr>
             <w:tcW w:type="dxa" w:w="2000"/>
-            <w:shd w:fill="FFFFFF" w:val="clear"/>
+            <w:shd w:val="clear" w:color="auto" w:fill="FFFFFF"/>
             <w:tcMar>
               <w:top w:type="dxa" w:w="80"/>
               <w:left w:type="dxa" w:w="120"/>
@@ -4269,7 +4265,7 @@
         <w:tc>
           <w:tcPr>
             <w:tcW w:type="dxa" w:w="1500"/>
-            <w:shd w:fill="FFFFFF" w:val="clear"/>
+            <w:shd w:val="clear" w:color="auto" w:fill="FFFFFF"/>
             <w:tcMar>
               <w:top w:type="dxa" w:w="80"/>
               <w:left w:type="dxa" w:w="120"/>
@@ -4285,7 +4281,7 @@
                 <w:color w:val="FFFFFF"/>
                 <w:sz w:val="16"/>
                 <w:szCs w:val="16"/>
-                <w:shd w:fill="D97706" w:val="clear"/>
+                <w:shd w:val="clear" w:color="auto" w:fill="D97706"/>
               </w:rPr>
               <w:t xml:space="preserve"> MEDIUM </w:t>
             </w:r>
@@ -4294,7 +4290,7 @@
         <w:tc>
           <w:tcPr>
             <w:tcW w:type="dxa" w:w="6240"/>
-            <w:shd w:fill="FFFFFF" w:val="clear"/>
+            <w:shd w:val="clear" w:color="auto" w:fill="FFFFFF"/>
             <w:tcMar>
               <w:top w:type="dxa" w:w="80"/>
               <w:left w:type="dxa" w:w="120"/>
@@ -4361,7 +4357,7 @@
         <w:tc>
           <w:tcPr>
             <w:tcW w:type="dxa" w:w="500"/>
-            <w:shd w:fill="7C3AED" w:val="clear"/>
+            <w:shd w:val="clear" w:color="auto" w:fill="7C3AED"/>
             <w:tcMar>
               <w:top w:type="dxa" w:w="80"/>
               <w:left w:type="dxa" w:w="120"/>
@@ -4385,7 +4381,7 @@
         <w:tc>
           <w:tcPr>
             <w:tcW w:type="dxa" w:w="4000"/>
-            <w:shd w:fill="7C3AED" w:val="clear"/>
+            <w:shd w:val="clear" w:color="auto" w:fill="7C3AED"/>
             <w:tcMar>
               <w:top w:type="dxa" w:w="80"/>
               <w:left w:type="dxa" w:w="120"/>
@@ -4409,7 +4405,7 @@
         <w:tc>
           <w:tcPr>
             <w:tcW w:type="dxa" w:w="2000"/>
-            <w:shd w:fill="7C3AED" w:val="clear"/>
+            <w:shd w:val="clear" w:color="auto" w:fill="7C3AED"/>
             <w:tcMar>
               <w:top w:type="dxa" w:w="80"/>
               <w:left w:type="dxa" w:w="120"/>
@@ -4433,7 +4429,7 @@
         <w:tc>
           <w:tcPr>
             <w:tcW w:type="dxa" w:w="1500"/>
-            <w:shd w:fill="7C3AED" w:val="clear"/>
+            <w:shd w:val="clear" w:color="auto" w:fill="7C3AED"/>
             <w:tcMar>
               <w:top w:type="dxa" w:w="80"/>
               <w:left w:type="dxa" w:w="120"/>
@@ -4457,7 +4453,7 @@
         <w:tc>
           <w:tcPr>
             <w:tcW w:type="dxa" w:w="6240"/>
-            <w:shd w:fill="7C3AED" w:val="clear"/>
+            <w:shd w:val="clear" w:color="auto" w:fill="7C3AED"/>
             <w:tcMar>
               <w:top w:type="dxa" w:w="80"/>
               <w:left w:type="dxa" w:w="120"/>
@@ -4483,7 +4479,7 @@
         <w:tc>
           <w:tcPr>
             <w:tcW w:type="dxa" w:w="500"/>
-            <w:shd w:fill="F5F3FF" w:val="clear"/>
+            <w:shd w:val="clear" w:color="auto" w:fill="F5F3FF"/>
             <w:tcMar>
               <w:top w:type="dxa" w:w="80"/>
               <w:left w:type="dxa" w:w="120"/>
@@ -4507,7 +4503,7 @@
         <w:tc>
           <w:tcPr>
             <w:tcW w:type="dxa" w:w="4000"/>
-            <w:shd w:fill="F5F3FF" w:val="clear"/>
+            <w:shd w:val="clear" w:color="auto" w:fill="F5F3FF"/>
             <w:tcMar>
               <w:top w:type="dxa" w:w="80"/>
               <w:left w:type="dxa" w:w="120"/>
@@ -4531,7 +4527,7 @@
         <w:tc>
           <w:tcPr>
             <w:tcW w:type="dxa" w:w="2000"/>
-            <w:shd w:fill="F5F3FF" w:val="clear"/>
+            <w:shd w:val="clear" w:color="auto" w:fill="F5F3FF"/>
             <w:tcMar>
               <w:top w:type="dxa" w:w="80"/>
               <w:left w:type="dxa" w:w="120"/>
@@ -4553,7 +4549,7 @@
         <w:tc>
           <w:tcPr>
             <w:tcW w:type="dxa" w:w="1500"/>
-            <w:shd w:fill="F5F3FF" w:val="clear"/>
+            <w:shd w:val="clear" w:color="auto" w:fill="F5F3FF"/>
             <w:tcMar>
               <w:top w:type="dxa" w:w="80"/>
               <w:left w:type="dxa" w:w="120"/>
@@ -4569,7 +4565,7 @@
                 <w:color w:val="FFFFFF"/>
                 <w:sz w:val="16"/>
                 <w:szCs w:val="16"/>
-                <w:shd w:fill="DC2626" w:val="clear"/>
+                <w:shd w:val="clear" w:color="auto" w:fill="DC2626"/>
               </w:rPr>
               <w:t xml:space="preserve"> HIGH </w:t>
             </w:r>
@@ -4578,7 +4574,7 @@
         <w:tc>
           <w:tcPr>
             <w:tcW w:type="dxa" w:w="6240"/>
-            <w:shd w:fill="F5F3FF" w:val="clear"/>
+            <w:shd w:val="clear" w:color="auto" w:fill="F5F3FF"/>
             <w:tcMar>
               <w:top w:type="dxa" w:w="80"/>
               <w:left w:type="dxa" w:w="120"/>
@@ -4602,7 +4598,7 @@
         <w:tc>
           <w:tcPr>
             <w:tcW w:type="dxa" w:w="500"/>
-            <w:shd w:fill="FFFFFF" w:val="clear"/>
+            <w:shd w:val="clear" w:color="auto" w:fill="FFFFFF"/>
             <w:tcMar>
               <w:top w:type="dxa" w:w="80"/>
               <w:left w:type="dxa" w:w="120"/>
@@ -4626,7 +4622,7 @@
         <w:tc>
           <w:tcPr>
             <w:tcW w:type="dxa" w:w="4000"/>
-            <w:shd w:fill="FFFFFF" w:val="clear"/>
+            <w:shd w:val="clear" w:color="auto" w:fill="FFFFFF"/>
             <w:tcMar>
               <w:top w:type="dxa" w:w="80"/>
               <w:left w:type="dxa" w:w="120"/>
@@ -4650,7 +4646,7 @@
         <w:tc>
           <w:tcPr>
             <w:tcW w:type="dxa" w:w="2000"/>
-            <w:shd w:fill="FFFFFF" w:val="clear"/>
+            <w:shd w:val="clear" w:color="auto" w:fill="FFFFFF"/>
             <w:tcMar>
               <w:top w:type="dxa" w:w="80"/>
               <w:left w:type="dxa" w:w="120"/>
@@ -4672,7 +4668,7 @@
         <w:tc>
           <w:tcPr>
             <w:tcW w:type="dxa" w:w="1500"/>
-            <w:shd w:fill="FFFFFF" w:val="clear"/>
+            <w:shd w:val="clear" w:color="auto" w:fill="FFFFFF"/>
             <w:tcMar>
               <w:top w:type="dxa" w:w="80"/>
               <w:left w:type="dxa" w:w="120"/>
@@ -4688,7 +4684,7 @@
                 <w:color w:val="FFFFFF"/>
                 <w:sz w:val="16"/>
                 <w:szCs w:val="16"/>
-                <w:shd w:fill="DC2626" w:val="clear"/>
+                <w:shd w:val="clear" w:color="auto" w:fill="DC2626"/>
               </w:rPr>
               <w:t xml:space="preserve"> HIGH </w:t>
             </w:r>
@@ -4697,7 +4693,7 @@
         <w:tc>
           <w:tcPr>
             <w:tcW w:type="dxa" w:w="6240"/>
-            <w:shd w:fill="FFFFFF" w:val="clear"/>
+            <w:shd w:val="clear" w:color="auto" w:fill="FFFFFF"/>
             <w:tcMar>
               <w:top w:type="dxa" w:w="80"/>
               <w:left w:type="dxa" w:w="120"/>
@@ -4721,7 +4717,7 @@
         <w:tc>
           <w:tcPr>
             <w:tcW w:type="dxa" w:w="500"/>
-            <w:shd w:fill="F5F3FF" w:val="clear"/>
+            <w:shd w:val="clear" w:color="auto" w:fill="F5F3FF"/>
             <w:tcMar>
               <w:top w:type="dxa" w:w="80"/>
               <w:left w:type="dxa" w:w="120"/>
@@ -4745,7 +4741,7 @@
         <w:tc>
           <w:tcPr>
             <w:tcW w:type="dxa" w:w="4000"/>
-            <w:shd w:fill="F5F3FF" w:val="clear"/>
+            <w:shd w:val="clear" w:color="auto" w:fill="F5F3FF"/>
             <w:tcMar>
               <w:top w:type="dxa" w:w="80"/>
               <w:left w:type="dxa" w:w="120"/>
@@ -4769,7 +4765,7 @@
         <w:tc>
           <w:tcPr>
             <w:tcW w:type="dxa" w:w="2000"/>
-            <w:shd w:fill="F5F3FF" w:val="clear"/>
+            <w:shd w:val="clear" w:color="auto" w:fill="F5F3FF"/>
             <w:tcMar>
               <w:top w:type="dxa" w:w="80"/>
               <w:left w:type="dxa" w:w="120"/>
@@ -4791,7 +4787,7 @@
         <w:tc>
           <w:tcPr>
             <w:tcW w:type="dxa" w:w="1500"/>
-            <w:shd w:fill="F5F3FF" w:val="clear"/>
+            <w:shd w:val="clear" w:color="auto" w:fill="F5F3FF"/>
             <w:tcMar>
               <w:top w:type="dxa" w:w="80"/>
               <w:left w:type="dxa" w:w="120"/>
@@ -4807,7 +4803,7 @@
                 <w:color w:val="FFFFFF"/>
                 <w:sz w:val="16"/>
                 <w:szCs w:val="16"/>
-                <w:shd w:fill="D97706" w:val="clear"/>
+                <w:shd w:val="clear" w:color="auto" w:fill="D97706"/>
               </w:rPr>
               <w:t xml:space="preserve"> MEDIUM </w:t>
             </w:r>
@@ -4816,7 +4812,7 @@
         <w:tc>
           <w:tcPr>
             <w:tcW w:type="dxa" w:w="6240"/>
-            <w:shd w:fill="F5F3FF" w:val="clear"/>
+            <w:shd w:val="clear" w:color="auto" w:fill="F5F3FF"/>
             <w:tcMar>
               <w:top w:type="dxa" w:w="80"/>
               <w:left w:type="dxa" w:w="120"/>
@@ -4840,7 +4836,7 @@
         <w:tc>
           <w:tcPr>
             <w:tcW w:type="dxa" w:w="500"/>
-            <w:shd w:fill="FFFFFF" w:val="clear"/>
+            <w:shd w:val="clear" w:color="auto" w:fill="FFFFFF"/>
             <w:tcMar>
               <w:top w:type="dxa" w:w="80"/>
               <w:left w:type="dxa" w:w="120"/>
@@ -4864,7 +4860,7 @@
         <w:tc>
           <w:tcPr>
             <w:tcW w:type="dxa" w:w="4000"/>
-            <w:shd w:fill="FFFFFF" w:val="clear"/>
+            <w:shd w:val="clear" w:color="auto" w:fill="FFFFFF"/>
             <w:tcMar>
               <w:top w:type="dxa" w:w="80"/>
               <w:left w:type="dxa" w:w="120"/>
@@ -4888,7 +4884,7 @@
         <w:tc>
           <w:tcPr>
             <w:tcW w:type="dxa" w:w="2000"/>
-            <w:shd w:fill="FFFFFF" w:val="clear"/>
+            <w:shd w:val="clear" w:color="auto" w:fill="FFFFFF"/>
             <w:tcMar>
               <w:top w:type="dxa" w:w="80"/>
               <w:left w:type="dxa" w:w="120"/>
@@ -4910,7 +4906,7 @@
         <w:tc>
           <w:tcPr>
             <w:tcW w:type="dxa" w:w="1500"/>
-            <w:shd w:fill="FFFFFF" w:val="clear"/>
+            <w:shd w:val="clear" w:color="auto" w:fill="FFFFFF"/>
             <w:tcMar>
               <w:top w:type="dxa" w:w="80"/>
               <w:left w:type="dxa" w:w="120"/>
@@ -4926,7 +4922,7 @@
                 <w:color w:val="FFFFFF"/>
                 <w:sz w:val="16"/>
                 <w:szCs w:val="16"/>
-                <w:shd w:fill="D97706" w:val="clear"/>
+                <w:shd w:val="clear" w:color="auto" w:fill="D97706"/>
               </w:rPr>
               <w:t xml:space="preserve"> MEDIUM </w:t>
             </w:r>
@@ -4935,7 +4931,7 @@
         <w:tc>
           <w:tcPr>
             <w:tcW w:type="dxa" w:w="6240"/>
-            <w:shd w:fill="FFFFFF" w:val="clear"/>
+            <w:shd w:val="clear" w:color="auto" w:fill="FFFFFF"/>
             <w:tcMar>
               <w:top w:type="dxa" w:w="80"/>
               <w:left w:type="dxa" w:w="120"/>
@@ -5002,7 +4998,7 @@
         <w:tc>
           <w:tcPr>
             <w:tcW w:type="dxa" w:w="500"/>
-            <w:shd w:fill="7C3AED" w:val="clear"/>
+            <w:shd w:val="clear" w:color="auto" w:fill="7C3AED"/>
             <w:tcMar>
               <w:top w:type="dxa" w:w="80"/>
               <w:left w:type="dxa" w:w="120"/>
@@ -5026,7 +5022,7 @@
         <w:tc>
           <w:tcPr>
             <w:tcW w:type="dxa" w:w="4000"/>
-            <w:shd w:fill="7C3AED" w:val="clear"/>
+            <w:shd w:val="clear" w:color="auto" w:fill="7C3AED"/>
             <w:tcMar>
               <w:top w:type="dxa" w:w="80"/>
               <w:left w:type="dxa" w:w="120"/>
@@ -5050,7 +5046,7 @@
         <w:tc>
           <w:tcPr>
             <w:tcW w:type="dxa" w:w="2000"/>
-            <w:shd w:fill="7C3AED" w:val="clear"/>
+            <w:shd w:val="clear" w:color="auto" w:fill="7C3AED"/>
             <w:tcMar>
               <w:top w:type="dxa" w:w="80"/>
               <w:left w:type="dxa" w:w="120"/>
@@ -5074,7 +5070,7 @@
         <w:tc>
           <w:tcPr>
             <w:tcW w:type="dxa" w:w="1500"/>
-            <w:shd w:fill="7C3AED" w:val="clear"/>
+            <w:shd w:val="clear" w:color="auto" w:fill="7C3AED"/>
             <w:tcMar>
               <w:top w:type="dxa" w:w="80"/>
               <w:left w:type="dxa" w:w="120"/>
@@ -5098,7 +5094,7 @@
         <w:tc>
           <w:tcPr>
             <w:tcW w:type="dxa" w:w="6240"/>
-            <w:shd w:fill="7C3AED" w:val="clear"/>
+            <w:shd w:val="clear" w:color="auto" w:fill="7C3AED"/>
             <w:tcMar>
               <w:top w:type="dxa" w:w="80"/>
               <w:left w:type="dxa" w:w="120"/>
@@ -5124,7 +5120,7 @@
         <w:tc>
           <w:tcPr>
             <w:tcW w:type="dxa" w:w="500"/>
-            <w:shd w:fill="F5F3FF" w:val="clear"/>
+            <w:shd w:val="clear" w:color="auto" w:fill="F5F3FF"/>
             <w:tcMar>
               <w:top w:type="dxa" w:w="80"/>
               <w:left w:type="dxa" w:w="120"/>
@@ -5148,7 +5144,7 @@
         <w:tc>
           <w:tcPr>
             <w:tcW w:type="dxa" w:w="4000"/>
-            <w:shd w:fill="F5F3FF" w:val="clear"/>
+            <w:shd w:val="clear" w:color="auto" w:fill="F5F3FF"/>
             <w:tcMar>
               <w:top w:type="dxa" w:w="80"/>
               <w:left w:type="dxa" w:w="120"/>
@@ -5172,7 +5168,7 @@
         <w:tc>
           <w:tcPr>
             <w:tcW w:type="dxa" w:w="2000"/>
-            <w:shd w:fill="F5F3FF" w:val="clear"/>
+            <w:shd w:val="clear" w:color="auto" w:fill="F5F3FF"/>
             <w:tcMar>
               <w:top w:type="dxa" w:w="80"/>
               <w:left w:type="dxa" w:w="120"/>
@@ -5194,7 +5190,7 @@
         <w:tc>
           <w:tcPr>
             <w:tcW w:type="dxa" w:w="1500"/>
-            <w:shd w:fill="F5F3FF" w:val="clear"/>
+            <w:shd w:val="clear" w:color="auto" w:fill="F5F3FF"/>
             <w:tcMar>
               <w:top w:type="dxa" w:w="80"/>
               <w:left w:type="dxa" w:w="120"/>
@@ -5210,7 +5206,7 @@
                 <w:color w:val="FFFFFF"/>
                 <w:sz w:val="16"/>
                 <w:szCs w:val="16"/>
-                <w:shd w:fill="DC2626" w:val="clear"/>
+                <w:shd w:val="clear" w:color="auto" w:fill="DC2626"/>
               </w:rPr>
               <w:t xml:space="preserve"> HIGH </w:t>
             </w:r>
@@ -5219,7 +5215,7 @@
         <w:tc>
           <w:tcPr>
             <w:tcW w:type="dxa" w:w="6240"/>
-            <w:shd w:fill="F5F3FF" w:val="clear"/>
+            <w:shd w:val="clear" w:color="auto" w:fill="F5F3FF"/>
             <w:tcMar>
               <w:top w:type="dxa" w:w="80"/>
               <w:left w:type="dxa" w:w="120"/>
@@ -5243,7 +5239,7 @@
         <w:tc>
           <w:tcPr>
             <w:tcW w:type="dxa" w:w="500"/>
-            <w:shd w:fill="FFFFFF" w:val="clear"/>
+            <w:shd w:val="clear" w:color="auto" w:fill="FFFFFF"/>
             <w:tcMar>
               <w:top w:type="dxa" w:w="80"/>
               <w:left w:type="dxa" w:w="120"/>
@@ -5267,7 +5263,7 @@
         <w:tc>
           <w:tcPr>
             <w:tcW w:type="dxa" w:w="4000"/>
-            <w:shd w:fill="FFFFFF" w:val="clear"/>
+            <w:shd w:val="clear" w:color="auto" w:fill="FFFFFF"/>
             <w:tcMar>
               <w:top w:type="dxa" w:w="80"/>
               <w:left w:type="dxa" w:w="120"/>
@@ -5291,7 +5287,7 @@
         <w:tc>
           <w:tcPr>
             <w:tcW w:type="dxa" w:w="2000"/>
-            <w:shd w:fill="FFFFFF" w:val="clear"/>
+            <w:shd w:val="clear" w:color="auto" w:fill="FFFFFF"/>
             <w:tcMar>
               <w:top w:type="dxa" w:w="80"/>
               <w:left w:type="dxa" w:w="120"/>
@@ -5313,7 +5309,7 @@
         <w:tc>
           <w:tcPr>
             <w:tcW w:type="dxa" w:w="1500"/>
-            <w:shd w:fill="FFFFFF" w:val="clear"/>
+            <w:shd w:val="clear" w:color="auto" w:fill="FFFFFF"/>
             <w:tcMar>
               <w:top w:type="dxa" w:w="80"/>
               <w:left w:type="dxa" w:w="120"/>
@@ -5329,7 +5325,7 @@
                 <w:color w:val="FFFFFF"/>
                 <w:sz w:val="16"/>
                 <w:szCs w:val="16"/>
-                <w:shd w:fill="D97706" w:val="clear"/>
+                <w:shd w:val="clear" w:color="auto" w:fill="D97706"/>
               </w:rPr>
               <w:t xml:space="preserve"> MEDIUM </w:t>
             </w:r>
@@ -5338,7 +5334,7 @@
         <w:tc>
           <w:tcPr>
             <w:tcW w:type="dxa" w:w="6240"/>
-            <w:shd w:fill="FFFFFF" w:val="clear"/>
+            <w:shd w:val="clear" w:color="auto" w:fill="FFFFFF"/>
             <w:tcMar>
               <w:top w:type="dxa" w:w="80"/>
               <w:left w:type="dxa" w:w="120"/>
@@ -5362,7 +5358,7 @@
         <w:tc>
           <w:tcPr>
             <w:tcW w:type="dxa" w:w="500"/>
-            <w:shd w:fill="F5F3FF" w:val="clear"/>
+            <w:shd w:val="clear" w:color="auto" w:fill="F5F3FF"/>
             <w:tcMar>
               <w:top w:type="dxa" w:w="80"/>
               <w:left w:type="dxa" w:w="120"/>
@@ -5386,7 +5382,7 @@
         <w:tc>
           <w:tcPr>
             <w:tcW w:type="dxa" w:w="4000"/>
-            <w:shd w:fill="F5F3FF" w:val="clear"/>
+            <w:shd w:val="clear" w:color="auto" w:fill="F5F3FF"/>
             <w:tcMar>
               <w:top w:type="dxa" w:w="80"/>
               <w:left w:type="dxa" w:w="120"/>
@@ -5410,7 +5406,7 @@
         <w:tc>
           <w:tcPr>
             <w:tcW w:type="dxa" w:w="2000"/>
-            <w:shd w:fill="F5F3FF" w:val="clear"/>
+            <w:shd w:val="clear" w:color="auto" w:fill="F5F3FF"/>
             <w:tcMar>
               <w:top w:type="dxa" w:w="80"/>
               <w:left w:type="dxa" w:w="120"/>
@@ -5432,7 +5428,7 @@
         <w:tc>
           <w:tcPr>
             <w:tcW w:type="dxa" w:w="1500"/>
-            <w:shd w:fill="F5F3FF" w:val="clear"/>
+            <w:shd w:val="clear" w:color="auto" w:fill="F5F3FF"/>
             <w:tcMar>
               <w:top w:type="dxa" w:w="80"/>
               <w:left w:type="dxa" w:w="120"/>
@@ -5448,7 +5444,7 @@
                 <w:color w:val="FFFFFF"/>
                 <w:sz w:val="16"/>
                 <w:szCs w:val="16"/>
-                <w:shd w:fill="D97706" w:val="clear"/>
+                <w:shd w:val="clear" w:color="auto" w:fill="D97706"/>
               </w:rPr>
               <w:t xml:space="preserve"> MEDIUM </w:t>
             </w:r>
@@ -5457,7 +5453,7 @@
         <w:tc>
           <w:tcPr>
             <w:tcW w:type="dxa" w:w="6240"/>
-            <w:shd w:fill="F5F3FF" w:val="clear"/>
+            <w:shd w:val="clear" w:color="auto" w:fill="F5F3FF"/>
             <w:tcMar>
               <w:top w:type="dxa" w:w="80"/>
               <w:left w:type="dxa" w:w="120"/>
@@ -5481,7 +5477,7 @@
         <w:tc>
           <w:tcPr>
             <w:tcW w:type="dxa" w:w="500"/>
-            <w:shd w:fill="FFFFFF" w:val="clear"/>
+            <w:shd w:val="clear" w:color="auto" w:fill="FFFFFF"/>
             <w:tcMar>
               <w:top w:type="dxa" w:w="80"/>
               <w:left w:type="dxa" w:w="120"/>
@@ -5505,7 +5501,7 @@
         <w:tc>
           <w:tcPr>
             <w:tcW w:type="dxa" w:w="4000"/>
-            <w:shd w:fill="FFFFFF" w:val="clear"/>
+            <w:shd w:val="clear" w:color="auto" w:fill="FFFFFF"/>
             <w:tcMar>
               <w:top w:type="dxa" w:w="80"/>
               <w:left w:type="dxa" w:w="120"/>
@@ -5529,7 +5525,7 @@
         <w:tc>
           <w:tcPr>
             <w:tcW w:type="dxa" w:w="2000"/>
-            <w:shd w:fill="FFFFFF" w:val="clear"/>
+            <w:shd w:val="clear" w:color="auto" w:fill="FFFFFF"/>
             <w:tcMar>
               <w:top w:type="dxa" w:w="80"/>
               <w:left w:type="dxa" w:w="120"/>
@@ -5551,7 +5547,7 @@
         <w:tc>
           <w:tcPr>
             <w:tcW w:type="dxa" w:w="1500"/>
-            <w:shd w:fill="FFFFFF" w:val="clear"/>
+            <w:shd w:val="clear" w:color="auto" w:fill="FFFFFF"/>
             <w:tcMar>
               <w:top w:type="dxa" w:w="80"/>
               <w:left w:type="dxa" w:w="120"/>
@@ -5567,7 +5563,7 @@
                 <w:color w:val="FFFFFF"/>
                 <w:sz w:val="16"/>
                 <w:szCs w:val="16"/>
-                <w:shd w:fill="059669" w:val="clear"/>
+                <w:shd w:val="clear" w:color="auto" w:fill="059669"/>
               </w:rPr>
               <w:t xml:space="preserve"> QUICK WIN </w:t>
             </w:r>
@@ -5576,7 +5572,7 @@
         <w:tc>
           <w:tcPr>
             <w:tcW w:type="dxa" w:w="6240"/>
-            <w:shd w:fill="FFFFFF" w:val="clear"/>
+            <w:shd w:val="clear" w:color="auto" w:fill="FFFFFF"/>
             <w:tcMar>
               <w:top w:type="dxa" w:w="80"/>
               <w:left w:type="dxa" w:w="120"/>
@@ -5643,7 +5639,7 @@
         <w:tc>
           <w:tcPr>
             <w:tcW w:type="dxa" w:w="500"/>
-            <w:shd w:fill="7C3AED" w:val="clear"/>
+            <w:shd w:val="clear" w:color="auto" w:fill="7C3AED"/>
             <w:tcMar>
               <w:top w:type="dxa" w:w="80"/>
               <w:left w:type="dxa" w:w="120"/>
@@ -5667,7 +5663,7 @@
         <w:tc>
           <w:tcPr>
             <w:tcW w:type="dxa" w:w="4000"/>
-            <w:shd w:fill="7C3AED" w:val="clear"/>
+            <w:shd w:val="clear" w:color="auto" w:fill="7C3AED"/>
             <w:tcMar>
               <w:top w:type="dxa" w:w="80"/>
               <w:left w:type="dxa" w:w="120"/>
@@ -5691,7 +5687,7 @@
         <w:tc>
           <w:tcPr>
             <w:tcW w:type="dxa" w:w="2000"/>
-            <w:shd w:fill="7C3AED" w:val="clear"/>
+            <w:shd w:val="clear" w:color="auto" w:fill="7C3AED"/>
             <w:tcMar>
               <w:top w:type="dxa" w:w="80"/>
               <w:left w:type="dxa" w:w="120"/>
@@ -5715,7 +5711,7 @@
         <w:tc>
           <w:tcPr>
             <w:tcW w:type="dxa" w:w="1500"/>
-            <w:shd w:fill="7C3AED" w:val="clear"/>
+            <w:shd w:val="clear" w:color="auto" w:fill="7C3AED"/>
             <w:tcMar>
               <w:top w:type="dxa" w:w="80"/>
               <w:left w:type="dxa" w:w="120"/>
@@ -5739,7 +5735,7 @@
         <w:tc>
           <w:tcPr>
             <w:tcW w:type="dxa" w:w="6240"/>
-            <w:shd w:fill="7C3AED" w:val="clear"/>
+            <w:shd w:val="clear" w:color="auto" w:fill="7C3AED"/>
             <w:tcMar>
               <w:top w:type="dxa" w:w="80"/>
               <w:left w:type="dxa" w:w="120"/>
@@ -5765,7 +5761,7 @@
         <w:tc>
           <w:tcPr>
             <w:tcW w:type="dxa" w:w="500"/>
-            <w:shd w:fill="F5F3FF" w:val="clear"/>
+            <w:shd w:val="clear" w:color="auto" w:fill="F5F3FF"/>
             <w:tcMar>
               <w:top w:type="dxa" w:w="80"/>
               <w:left w:type="dxa" w:w="120"/>
@@ -5789,7 +5785,7 @@
         <w:tc>
           <w:tcPr>
             <w:tcW w:type="dxa" w:w="4000"/>
-            <w:shd w:fill="F5F3FF" w:val="clear"/>
+            <w:shd w:val="clear" w:color="auto" w:fill="F5F3FF"/>
             <w:tcMar>
               <w:top w:type="dxa" w:w="80"/>
               <w:left w:type="dxa" w:w="120"/>
@@ -5813,7 +5809,7 @@
         <w:tc>
           <w:tcPr>
             <w:tcW w:type="dxa" w:w="2000"/>
-            <w:shd w:fill="F5F3FF" w:val="clear"/>
+            <w:shd w:val="clear" w:color="auto" w:fill="F5F3FF"/>
             <w:tcMar>
               <w:top w:type="dxa" w:w="80"/>
               <w:left w:type="dxa" w:w="120"/>
@@ -5835,7 +5831,7 @@
         <w:tc>
           <w:tcPr>
             <w:tcW w:type="dxa" w:w="1500"/>
-            <w:shd w:fill="F5F3FF" w:val="clear"/>
+            <w:shd w:val="clear" w:color="auto" w:fill="F5F3FF"/>
             <w:tcMar>
               <w:top w:type="dxa" w:w="80"/>
               <w:left w:type="dxa" w:w="120"/>
@@ -5851,7 +5847,7 @@
                 <w:color w:val="FFFFFF"/>
                 <w:sz w:val="16"/>
                 <w:szCs w:val="16"/>
-                <w:shd w:fill="DC2626" w:val="clear"/>
+                <w:shd w:val="clear" w:color="auto" w:fill="DC2626"/>
               </w:rPr>
               <w:t xml:space="preserve"> HIGH </w:t>
             </w:r>
@@ -5860,7 +5856,7 @@
         <w:tc>
           <w:tcPr>
             <w:tcW w:type="dxa" w:w="6240"/>
-            <w:shd w:fill="F5F3FF" w:val="clear"/>
+            <w:shd w:val="clear" w:color="auto" w:fill="F5F3FF"/>
             <w:tcMar>
               <w:top w:type="dxa" w:w="80"/>
               <w:left w:type="dxa" w:w="120"/>
@@ -5884,7 +5880,7 @@
         <w:tc>
           <w:tcPr>
             <w:tcW w:type="dxa" w:w="500"/>
-            <w:shd w:fill="FFFFFF" w:val="clear"/>
+            <w:shd w:val="clear" w:color="auto" w:fill="FFFFFF"/>
             <w:tcMar>
               <w:top w:type="dxa" w:w="80"/>
               <w:left w:type="dxa" w:w="120"/>
@@ -5908,7 +5904,7 @@
         <w:tc>
           <w:tcPr>
             <w:tcW w:type="dxa" w:w="4000"/>
-            <w:shd w:fill="FFFFFF" w:val="clear"/>
+            <w:shd w:val="clear" w:color="auto" w:fill="FFFFFF"/>
             <w:tcMar>
               <w:top w:type="dxa" w:w="80"/>
               <w:left w:type="dxa" w:w="120"/>
@@ -5932,7 +5928,7 @@
         <w:tc>
           <w:tcPr>
             <w:tcW w:type="dxa" w:w="2000"/>
-            <w:shd w:fill="FFFFFF" w:val="clear"/>
+            <w:shd w:val="clear" w:color="auto" w:fill="FFFFFF"/>
             <w:tcMar>
               <w:top w:type="dxa" w:w="80"/>
               <w:left w:type="dxa" w:w="120"/>
@@ -5954,7 +5950,7 @@
         <w:tc>
           <w:tcPr>
             <w:tcW w:type="dxa" w:w="1500"/>
-            <w:shd w:fill="FFFFFF" w:val="clear"/>
+            <w:shd w:val="clear" w:color="auto" w:fill="FFFFFF"/>
             <w:tcMar>
               <w:top w:type="dxa" w:w="80"/>
               <w:left w:type="dxa" w:w="120"/>
@@ -5970,7 +5966,7 @@
                 <w:color w:val="FFFFFF"/>
                 <w:sz w:val="16"/>
                 <w:szCs w:val="16"/>
-                <w:shd w:fill="D97706" w:val="clear"/>
+                <w:shd w:val="clear" w:color="auto" w:fill="D97706"/>
               </w:rPr>
               <w:t xml:space="preserve"> MEDIUM </w:t>
             </w:r>
@@ -5979,7 +5975,7 @@
         <w:tc>
           <w:tcPr>
             <w:tcW w:type="dxa" w:w="6240"/>
-            <w:shd w:fill="FFFFFF" w:val="clear"/>
+            <w:shd w:val="clear" w:color="auto" w:fill="FFFFFF"/>
             <w:tcMar>
               <w:top w:type="dxa" w:w="80"/>
               <w:left w:type="dxa" w:w="120"/>
@@ -6003,7 +5999,7 @@
         <w:tc>
           <w:tcPr>
             <w:tcW w:type="dxa" w:w="500"/>
-            <w:shd w:fill="F5F3FF" w:val="clear"/>
+            <w:shd w:val="clear" w:color="auto" w:fill="F5F3FF"/>
             <w:tcMar>
               <w:top w:type="dxa" w:w="80"/>
               <w:left w:type="dxa" w:w="120"/>
@@ -6027,7 +6023,7 @@
         <w:tc>
           <w:tcPr>
             <w:tcW w:type="dxa" w:w="4000"/>
-            <w:shd w:fill="F5F3FF" w:val="clear"/>
+            <w:shd w:val="clear" w:color="auto" w:fill="F5F3FF"/>
             <w:tcMar>
               <w:top w:type="dxa" w:w="80"/>
               <w:left w:type="dxa" w:w="120"/>
@@ -6051,7 +6047,7 @@
         <w:tc>
           <w:tcPr>
             <w:tcW w:type="dxa" w:w="2000"/>
-            <w:shd w:fill="F5F3FF" w:val="clear"/>
+            <w:shd w:val="clear" w:color="auto" w:fill="F5F3FF"/>
             <w:tcMar>
               <w:top w:type="dxa" w:w="80"/>
               <w:left w:type="dxa" w:w="120"/>
@@ -6073,7 +6069,7 @@
         <w:tc>
           <w:tcPr>
             <w:tcW w:type="dxa" w:w="1500"/>
-            <w:shd w:fill="F5F3FF" w:val="clear"/>
+            <w:shd w:val="clear" w:color="auto" w:fill="F5F3FF"/>
             <w:tcMar>
               <w:top w:type="dxa" w:w="80"/>
               <w:left w:type="dxa" w:w="120"/>
@@ -6089,7 +6085,7 @@
                 <w:color w:val="FFFFFF"/>
                 <w:sz w:val="16"/>
                 <w:szCs w:val="16"/>
-                <w:shd w:fill="DC2626" w:val="clear"/>
+                <w:shd w:val="clear" w:color="auto" w:fill="DC2626"/>
               </w:rPr>
               <w:t xml:space="preserve"> HIGH </w:t>
             </w:r>
@@ -6098,7 +6094,7 @@
         <w:tc>
           <w:tcPr>
             <w:tcW w:type="dxa" w:w="6240"/>
-            <w:shd w:fill="F5F3FF" w:val="clear"/>
+            <w:shd w:val="clear" w:color="auto" w:fill="F5F3FF"/>
             <w:tcMar>
               <w:top w:type="dxa" w:w="80"/>
               <w:left w:type="dxa" w:w="120"/>
@@ -6122,7 +6118,7 @@
         <w:tc>
           <w:tcPr>
             <w:tcW w:type="dxa" w:w="500"/>
-            <w:shd w:fill="FFFFFF" w:val="clear"/>
+            <w:shd w:val="clear" w:color="auto" w:fill="FFFFFF"/>
             <w:tcMar>
               <w:top w:type="dxa" w:w="80"/>
               <w:left w:type="dxa" w:w="120"/>
@@ -6146,7 +6142,7 @@
         <w:tc>
           <w:tcPr>
             <w:tcW w:type="dxa" w:w="4000"/>
-            <w:shd w:fill="FFFFFF" w:val="clear"/>
+            <w:shd w:val="clear" w:color="auto" w:fill="FFFFFF"/>
             <w:tcMar>
               <w:top w:type="dxa" w:w="80"/>
               <w:left w:type="dxa" w:w="120"/>
@@ -6170,7 +6166,7 @@
         <w:tc>
           <w:tcPr>
             <w:tcW w:type="dxa" w:w="2000"/>
-            <w:shd w:fill="FFFFFF" w:val="clear"/>
+            <w:shd w:val="clear" w:color="auto" w:fill="FFFFFF"/>
             <w:tcMar>
               <w:top w:type="dxa" w:w="80"/>
               <w:left w:type="dxa" w:w="120"/>
@@ -6192,7 +6188,7 @@
         <w:tc>
           <w:tcPr>
             <w:tcW w:type="dxa" w:w="1500"/>
-            <w:shd w:fill="FFFFFF" w:val="clear"/>
+            <w:shd w:val="clear" w:color="auto" w:fill="FFFFFF"/>
             <w:tcMar>
               <w:top w:type="dxa" w:w="80"/>
               <w:left w:type="dxa" w:w="120"/>
@@ -6208,7 +6204,7 @@
                 <w:color w:val="FFFFFF"/>
                 <w:sz w:val="16"/>
                 <w:szCs w:val="16"/>
-                <w:shd w:fill="D97706" w:val="clear"/>
+                <w:shd w:val="clear" w:color="auto" w:fill="D97706"/>
               </w:rPr>
               <w:t xml:space="preserve"> MEDIUM </w:t>
             </w:r>
@@ -6217,7 +6213,7 @@
         <w:tc>
           <w:tcPr>
             <w:tcW w:type="dxa" w:w="6240"/>
-            <w:shd w:fill="FFFFFF" w:val="clear"/>
+            <w:shd w:val="clear" w:color="auto" w:fill="FFFFFF"/>
             <w:tcMar>
               <w:top w:type="dxa" w:w="80"/>
               <w:left w:type="dxa" w:w="120"/>
@@ -6284,7 +6280,7 @@
         <w:tc>
           <w:tcPr>
             <w:tcW w:type="dxa" w:w="500"/>
-            <w:shd w:fill="7C3AED" w:val="clear"/>
+            <w:shd w:val="clear" w:color="auto" w:fill="7C3AED"/>
             <w:tcMar>
               <w:top w:type="dxa" w:w="80"/>
               <w:left w:type="dxa" w:w="120"/>
@@ -6308,7 +6304,7 @@
         <w:tc>
           <w:tcPr>
             <w:tcW w:type="dxa" w:w="4000"/>
-            <w:shd w:fill="7C3AED" w:val="clear"/>
+            <w:shd w:val="clear" w:color="auto" w:fill="7C3AED"/>
             <w:tcMar>
               <w:top w:type="dxa" w:w="80"/>
               <w:left w:type="dxa" w:w="120"/>
@@ -6332,7 +6328,7 @@
         <w:tc>
           <w:tcPr>
             <w:tcW w:type="dxa" w:w="2000"/>
-            <w:shd w:fill="7C3AED" w:val="clear"/>
+            <w:shd w:val="clear" w:color="auto" w:fill="7C3AED"/>
             <w:tcMar>
               <w:top w:type="dxa" w:w="80"/>
               <w:left w:type="dxa" w:w="120"/>
@@ -6356,7 +6352,7 @@
         <w:tc>
           <w:tcPr>
             <w:tcW w:type="dxa" w:w="1500"/>
-            <w:shd w:fill="7C3AED" w:val="clear"/>
+            <w:shd w:val="clear" w:color="auto" w:fill="7C3AED"/>
             <w:tcMar>
               <w:top w:type="dxa" w:w="80"/>
               <w:left w:type="dxa" w:w="120"/>
@@ -6380,7 +6376,7 @@
         <w:tc>
           <w:tcPr>
             <w:tcW w:type="dxa" w:w="6240"/>
-            <w:shd w:fill="7C3AED" w:val="clear"/>
+            <w:shd w:val="clear" w:color="auto" w:fill="7C3AED"/>
             <w:tcMar>
               <w:top w:type="dxa" w:w="80"/>
               <w:left w:type="dxa" w:w="120"/>
@@ -6406,7 +6402,7 @@
         <w:tc>
           <w:tcPr>
             <w:tcW w:type="dxa" w:w="500"/>
-            <w:shd w:fill="F5F3FF" w:val="clear"/>
+            <w:shd w:val="clear" w:color="auto" w:fill="F5F3FF"/>
             <w:tcMar>
               <w:top w:type="dxa" w:w="80"/>
               <w:left w:type="dxa" w:w="120"/>
@@ -6430,7 +6426,7 @@
         <w:tc>
           <w:tcPr>
             <w:tcW w:type="dxa" w:w="4000"/>
-            <w:shd w:fill="F5F3FF" w:val="clear"/>
+            <w:shd w:val="clear" w:color="auto" w:fill="F5F3FF"/>
             <w:tcMar>
               <w:top w:type="dxa" w:w="80"/>
               <w:left w:type="dxa" w:w="120"/>
@@ -6454,7 +6450,7 @@
         <w:tc>
           <w:tcPr>
             <w:tcW w:type="dxa" w:w="2000"/>
-            <w:shd w:fill="F5F3FF" w:val="clear"/>
+            <w:shd w:val="clear" w:color="auto" w:fill="F5F3FF"/>
             <w:tcMar>
               <w:top w:type="dxa" w:w="80"/>
               <w:left w:type="dxa" w:w="120"/>
@@ -6476,7 +6472,7 @@
         <w:tc>
           <w:tcPr>
             <w:tcW w:type="dxa" w:w="1500"/>
-            <w:shd w:fill="F5F3FF" w:val="clear"/>
+            <w:shd w:val="clear" w:color="auto" w:fill="F5F3FF"/>
             <w:tcMar>
               <w:top w:type="dxa" w:w="80"/>
               <w:left w:type="dxa" w:w="120"/>
@@ -6492,7 +6488,7 @@
                 <w:color w:val="FFFFFF"/>
                 <w:sz w:val="16"/>
                 <w:szCs w:val="16"/>
-                <w:shd w:fill="DC2626" w:val="clear"/>
+                <w:shd w:val="clear" w:color="auto" w:fill="DC2626"/>
               </w:rPr>
               <w:t xml:space="preserve"> HIGH </w:t>
             </w:r>
@@ -6501,7 +6497,7 @@
         <w:tc>
           <w:tcPr>
             <w:tcW w:type="dxa" w:w="6240"/>
-            <w:shd w:fill="F5F3FF" w:val="clear"/>
+            <w:shd w:val="clear" w:color="auto" w:fill="F5F3FF"/>
             <w:tcMar>
               <w:top w:type="dxa" w:w="80"/>
               <w:left w:type="dxa" w:w="120"/>
@@ -6525,7 +6521,7 @@
         <w:tc>
           <w:tcPr>
             <w:tcW w:type="dxa" w:w="500"/>
-            <w:shd w:fill="FFFFFF" w:val="clear"/>
+            <w:shd w:val="clear" w:color="auto" w:fill="FFFFFF"/>
             <w:tcMar>
               <w:top w:type="dxa" w:w="80"/>
               <w:left w:type="dxa" w:w="120"/>
@@ -6549,7 +6545,7 @@
         <w:tc>
           <w:tcPr>
             <w:tcW w:type="dxa" w:w="4000"/>
-            <w:shd w:fill="FFFFFF" w:val="clear"/>
+            <w:shd w:val="clear" w:color="auto" w:fill="FFFFFF"/>
             <w:tcMar>
               <w:top w:type="dxa" w:w="80"/>
               <w:left w:type="dxa" w:w="120"/>
@@ -6573,7 +6569,7 @@
         <w:tc>
           <w:tcPr>
             <w:tcW w:type="dxa" w:w="2000"/>
-            <w:shd w:fill="FFFFFF" w:val="clear"/>
+            <w:shd w:val="clear" w:color="auto" w:fill="FFFFFF"/>
             <w:tcMar>
               <w:top w:type="dxa" w:w="80"/>
               <w:left w:type="dxa" w:w="120"/>
@@ -6595,7 +6591,7 @@
         <w:tc>
           <w:tcPr>
             <w:tcW w:type="dxa" w:w="1500"/>
-            <w:shd w:fill="FFFFFF" w:val="clear"/>
+            <w:shd w:val="clear" w:color="auto" w:fill="FFFFFF"/>
             <w:tcMar>
               <w:top w:type="dxa" w:w="80"/>
               <w:left w:type="dxa" w:w="120"/>
@@ -6611,7 +6607,7 @@
                 <w:color w:val="FFFFFF"/>
                 <w:sz w:val="16"/>
                 <w:szCs w:val="16"/>
-                <w:shd w:fill="D97706" w:val="clear"/>
+                <w:shd w:val="clear" w:color="auto" w:fill="D97706"/>
               </w:rPr>
               <w:t xml:space="preserve"> MEDIUM </w:t>
             </w:r>
@@ -6620,7 +6616,7 @@
         <w:tc>
           <w:tcPr>
             <w:tcW w:type="dxa" w:w="6240"/>
-            <w:shd w:fill="FFFFFF" w:val="clear"/>
+            <w:shd w:val="clear" w:color="auto" w:fill="FFFFFF"/>
             <w:tcMar>
               <w:top w:type="dxa" w:w="80"/>
               <w:left w:type="dxa" w:w="120"/>
@@ -6644,7 +6640,7 @@
         <w:tc>
           <w:tcPr>
             <w:tcW w:type="dxa" w:w="500"/>
-            <w:shd w:fill="F5F3FF" w:val="clear"/>
+            <w:shd w:val="clear" w:color="auto" w:fill="F5F3FF"/>
             <w:tcMar>
               <w:top w:type="dxa" w:w="80"/>
               <w:left w:type="dxa" w:w="120"/>
@@ -6668,7 +6664,7 @@
         <w:tc>
           <w:tcPr>
             <w:tcW w:type="dxa" w:w="4000"/>
-            <w:shd w:fill="F5F3FF" w:val="clear"/>
+            <w:shd w:val="clear" w:color="auto" w:fill="F5F3FF"/>
             <w:tcMar>
               <w:top w:type="dxa" w:w="80"/>
               <w:left w:type="dxa" w:w="120"/>
@@ -6692,7 +6688,7 @@
         <w:tc>
           <w:tcPr>
             <w:tcW w:type="dxa" w:w="2000"/>
-            <w:shd w:fill="F5F3FF" w:val="clear"/>
+            <w:shd w:val="clear" w:color="auto" w:fill="F5F3FF"/>
             <w:tcMar>
               <w:top w:type="dxa" w:w="80"/>
               <w:left w:type="dxa" w:w="120"/>
@@ -6714,7 +6710,7 @@
         <w:tc>
           <w:tcPr>
             <w:tcW w:type="dxa" w:w="1500"/>
-            <w:shd w:fill="F5F3FF" w:val="clear"/>
+            <w:shd w:val="clear" w:color="auto" w:fill="F5F3FF"/>
             <w:tcMar>
               <w:top w:type="dxa" w:w="80"/>
               <w:left w:type="dxa" w:w="120"/>
@@ -6730,7 +6726,7 @@
                 <w:color w:val="FFFFFF"/>
                 <w:sz w:val="16"/>
                 <w:szCs w:val="16"/>
-                <w:shd w:fill="D97706" w:val="clear"/>
+                <w:shd w:val="clear" w:color="auto" w:fill="D97706"/>
               </w:rPr>
               <w:t xml:space="preserve"> MEDIUM </w:t>
             </w:r>
@@ -6739,7 +6735,7 @@
         <w:tc>
           <w:tcPr>
             <w:tcW w:type="dxa" w:w="6240"/>
-            <w:shd w:fill="F5F3FF" w:val="clear"/>
+            <w:shd w:val="clear" w:color="auto" w:fill="F5F3FF"/>
             <w:tcMar>
               <w:top w:type="dxa" w:w="80"/>
               <w:left w:type="dxa" w:w="120"/>
@@ -6763,7 +6759,7 @@
         <w:tc>
           <w:tcPr>
             <w:tcW w:type="dxa" w:w="500"/>
-            <w:shd w:fill="FFFFFF" w:val="clear"/>
+            <w:shd w:val="clear" w:color="auto" w:fill="FFFFFF"/>
             <w:tcMar>
               <w:top w:type="dxa" w:w="80"/>
               <w:left w:type="dxa" w:w="120"/>
@@ -6787,7 +6783,7 @@
         <w:tc>
           <w:tcPr>
             <w:tcW w:type="dxa" w:w="4000"/>
-            <w:shd w:fill="FFFFFF" w:val="clear"/>
+            <w:shd w:val="clear" w:color="auto" w:fill="FFFFFF"/>
             <w:tcMar>
               <w:top w:type="dxa" w:w="80"/>
               <w:left w:type="dxa" w:w="120"/>
@@ -6811,7 +6807,7 @@
         <w:tc>
           <w:tcPr>
             <w:tcW w:type="dxa" w:w="2000"/>
-            <w:shd w:fill="FFFFFF" w:val="clear"/>
+            <w:shd w:val="clear" w:color="auto" w:fill="FFFFFF"/>
             <w:tcMar>
               <w:top w:type="dxa" w:w="80"/>
               <w:left w:type="dxa" w:w="120"/>
@@ -6833,7 +6829,7 @@
         <w:tc>
           <w:tcPr>
             <w:tcW w:type="dxa" w:w="1500"/>
-            <w:shd w:fill="FFFFFF" w:val="clear"/>
+            <w:shd w:val="clear" w:color="auto" w:fill="FFFFFF"/>
             <w:tcMar>
               <w:top w:type="dxa" w:w="80"/>
               <w:left w:type="dxa" w:w="120"/>
@@ -6849,7 +6845,7 @@
                 <w:color w:val="FFFFFF"/>
                 <w:sz w:val="16"/>
                 <w:szCs w:val="16"/>
-                <w:shd w:fill="059669" w:val="clear"/>
+                <w:shd w:val="clear" w:color="auto" w:fill="059669"/>
               </w:rPr>
               <w:t xml:space="preserve"> QUICK WIN </w:t>
             </w:r>
@@ -6858,7 +6854,7 @@
         <w:tc>
           <w:tcPr>
             <w:tcW w:type="dxa" w:w="6240"/>
-            <w:shd w:fill="FFFFFF" w:val="clear"/>
+            <w:shd w:val="clear" w:color="auto" w:fill="FFFFFF"/>
             <w:tcMar>
               <w:top w:type="dxa" w:w="80"/>
               <w:left w:type="dxa" w:w="120"/>
@@ -6950,7 +6946,7 @@
         <w:tc>
           <w:tcPr>
             <w:tcW w:type="dxa" w:w="500"/>
-            <w:shd w:fill="059669" w:val="clear"/>
+            <w:shd w:val="clear" w:color="auto" w:fill="059669"/>
             <w:tcMar>
               <w:top w:type="dxa" w:w="80"/>
               <w:left w:type="dxa" w:w="120"/>
@@ -6974,7 +6970,7 @@
         <w:tc>
           <w:tcPr>
             <w:tcW w:type="dxa" w:w="4500"/>
-            <w:shd w:fill="059669" w:val="clear"/>
+            <w:shd w:val="clear" w:color="auto" w:fill="059669"/>
             <w:tcMar>
               <w:top w:type="dxa" w:w="80"/>
               <w:left w:type="dxa" w:w="120"/>
@@ -6998,7 +6994,7 @@
         <w:tc>
           <w:tcPr>
             <w:tcW w:type="dxa" w:w="2500"/>
-            <w:shd w:fill="059669" w:val="clear"/>
+            <w:shd w:val="clear" w:color="auto" w:fill="059669"/>
             <w:tcMar>
               <w:top w:type="dxa" w:w="80"/>
               <w:left w:type="dxa" w:w="120"/>
@@ -7022,7 +7018,7 @@
         <w:tc>
           <w:tcPr>
             <w:tcW w:type="dxa" w:w="6740"/>
-            <w:shd w:fill="059669" w:val="clear"/>
+            <w:shd w:val="clear" w:color="auto" w:fill="059669"/>
             <w:tcMar>
               <w:top w:type="dxa" w:w="80"/>
               <w:left w:type="dxa" w:w="120"/>
@@ -7048,7 +7044,7 @@
         <w:tc>
           <w:tcPr>
             <w:tcW w:type="dxa" w:w="500"/>
-            <w:shd w:fill="ECFDF5" w:val="clear"/>
+            <w:shd w:val="clear" w:color="auto" w:fill="ECFDF5"/>
             <w:tcMar>
               <w:top w:type="dxa" w:w="80"/>
               <w:left w:type="dxa" w:w="120"/>
@@ -7072,7 +7068,7 @@
         <w:tc>
           <w:tcPr>
             <w:tcW w:type="dxa" w:w="4500"/>
-            <w:shd w:fill="ECFDF5" w:val="clear"/>
+            <w:shd w:val="clear" w:color="auto" w:fill="ECFDF5"/>
             <w:tcMar>
               <w:top w:type="dxa" w:w="80"/>
               <w:left w:type="dxa" w:w="120"/>
@@ -7094,7 +7090,7 @@
         <w:tc>
           <w:tcPr>
             <w:tcW w:type="dxa" w:w="2500"/>
-            <w:shd w:fill="ECFDF5" w:val="clear"/>
+            <w:shd w:val="clear" w:color="auto" w:fill="ECFDF5"/>
             <w:tcMar>
               <w:top w:type="dxa" w:w="80"/>
               <w:left w:type="dxa" w:w="120"/>
@@ -7116,7 +7112,7 @@
         <w:tc>
           <w:tcPr>
             <w:tcW w:type="dxa" w:w="6740"/>
-            <w:shd w:fill="ECFDF5" w:val="clear"/>
+            <w:shd w:val="clear" w:color="auto" w:fill="ECFDF5"/>
             <w:tcMar>
               <w:top w:type="dxa" w:w="80"/>
               <w:left w:type="dxa" w:w="120"/>
@@ -7140,7 +7136,7 @@
         <w:tc>
           <w:tcPr>
             <w:tcW w:type="dxa" w:w="500"/>
-            <w:shd w:fill="FFFFFF" w:val="clear"/>
+            <w:shd w:val="clear" w:color="auto" w:fill="FFFFFF"/>
             <w:tcMar>
               <w:top w:type="dxa" w:w="80"/>
               <w:left w:type="dxa" w:w="120"/>
@@ -7164,7 +7160,7 @@
         <w:tc>
           <w:tcPr>
             <w:tcW w:type="dxa" w:w="4500"/>
-            <w:shd w:fill="FFFFFF" w:val="clear"/>
+            <w:shd w:val="clear" w:color="auto" w:fill="FFFFFF"/>
             <w:tcMar>
               <w:top w:type="dxa" w:w="80"/>
               <w:left w:type="dxa" w:w="120"/>
@@ -7186,7 +7182,7 @@
         <w:tc>
           <w:tcPr>
             <w:tcW w:type="dxa" w:w="2500"/>
-            <w:shd w:fill="FFFFFF" w:val="clear"/>
+            <w:shd w:val="clear" w:color="auto" w:fill="FFFFFF"/>
             <w:tcMar>
               <w:top w:type="dxa" w:w="80"/>
               <w:left w:type="dxa" w:w="120"/>
@@ -7208,7 +7204,7 @@
         <w:tc>
           <w:tcPr>
             <w:tcW w:type="dxa" w:w="6740"/>
-            <w:shd w:fill="FFFFFF" w:val="clear"/>
+            <w:shd w:val="clear" w:color="auto" w:fill="FFFFFF"/>
             <w:tcMar>
               <w:top w:type="dxa" w:w="80"/>
               <w:left w:type="dxa" w:w="120"/>
@@ -7232,7 +7228,7 @@
         <w:tc>
           <w:tcPr>
             <w:tcW w:type="dxa" w:w="500"/>
-            <w:shd w:fill="ECFDF5" w:val="clear"/>
+            <w:shd w:val="clear" w:color="auto" w:fill="ECFDF5"/>
             <w:tcMar>
               <w:top w:type="dxa" w:w="80"/>
               <w:left w:type="dxa" w:w="120"/>
@@ -7256,7 +7252,7 @@
         <w:tc>
           <w:tcPr>
             <w:tcW w:type="dxa" w:w="4500"/>
-            <w:shd w:fill="ECFDF5" w:val="clear"/>
+            <w:shd w:val="clear" w:color="auto" w:fill="ECFDF5"/>
             <w:tcMar>
               <w:top w:type="dxa" w:w="80"/>
               <w:left w:type="dxa" w:w="120"/>
@@ -7278,7 +7274,7 @@
         <w:tc>
           <w:tcPr>
             <w:tcW w:type="dxa" w:w="2500"/>
-            <w:shd w:fill="ECFDF5" w:val="clear"/>
+            <w:shd w:val="clear" w:color="auto" w:fill="ECFDF5"/>
             <w:tcMar>
               <w:top w:type="dxa" w:w="80"/>
               <w:left w:type="dxa" w:w="120"/>
@@ -7300,7 +7296,7 @@
         <w:tc>
           <w:tcPr>
             <w:tcW w:type="dxa" w:w="6740"/>
-            <w:shd w:fill="ECFDF5" w:val="clear"/>
+            <w:shd w:val="clear" w:color="auto" w:fill="ECFDF5"/>
             <w:tcMar>
               <w:top w:type="dxa" w:w="80"/>
               <w:left w:type="dxa" w:w="120"/>
@@ -7324,7 +7320,7 @@
         <w:tc>
           <w:tcPr>
             <w:tcW w:type="dxa" w:w="500"/>
-            <w:shd w:fill="FFFFFF" w:val="clear"/>
+            <w:shd w:val="clear" w:color="auto" w:fill="FFFFFF"/>
             <w:tcMar>
               <w:top w:type="dxa" w:w="80"/>
               <w:left w:type="dxa" w:w="120"/>
@@ -7348,7 +7344,7 @@
         <w:tc>
           <w:tcPr>
             <w:tcW w:type="dxa" w:w="4500"/>
-            <w:shd w:fill="FFFFFF" w:val="clear"/>
+            <w:shd w:val="clear" w:color="auto" w:fill="FFFFFF"/>
             <w:tcMar>
               <w:top w:type="dxa" w:w="80"/>
               <w:left w:type="dxa" w:w="120"/>
@@ -7370,7 +7366,7 @@
         <w:tc>
           <w:tcPr>
             <w:tcW w:type="dxa" w:w="2500"/>
-            <w:shd w:fill="FFFFFF" w:val="clear"/>
+            <w:shd w:val="clear" w:color="auto" w:fill="FFFFFF"/>
             <w:tcMar>
               <w:top w:type="dxa" w:w="80"/>
               <w:left w:type="dxa" w:w="120"/>
@@ -7392,7 +7388,7 @@
         <w:tc>
           <w:tcPr>
             <w:tcW w:type="dxa" w:w="6740"/>
-            <w:shd w:fill="FFFFFF" w:val="clear"/>
+            <w:shd w:val="clear" w:color="auto" w:fill="FFFFFF"/>
             <w:tcMar>
               <w:top w:type="dxa" w:w="80"/>
               <w:left w:type="dxa" w:w="120"/>
@@ -7416,7 +7412,7 @@
         <w:tc>
           <w:tcPr>
             <w:tcW w:type="dxa" w:w="500"/>
-            <w:shd w:fill="ECFDF5" w:val="clear"/>
+            <w:shd w:val="clear" w:color="auto" w:fill="ECFDF5"/>
             <w:tcMar>
               <w:top w:type="dxa" w:w="80"/>
               <w:left w:type="dxa" w:w="120"/>
@@ -7440,7 +7436,7 @@
         <w:tc>
           <w:tcPr>
             <w:tcW w:type="dxa" w:w="4500"/>
-            <w:shd w:fill="ECFDF5" w:val="clear"/>
+            <w:shd w:val="clear" w:color="auto" w:fill="ECFDF5"/>
             <w:tcMar>
               <w:top w:type="dxa" w:w="80"/>
               <w:left w:type="dxa" w:w="120"/>
@@ -7462,7 +7458,7 @@
         <w:tc>
           <w:tcPr>
             <w:tcW w:type="dxa" w:w="2500"/>
-            <w:shd w:fill="ECFDF5" w:val="clear"/>
+            <w:shd w:val="clear" w:color="auto" w:fill="ECFDF5"/>
             <w:tcMar>
               <w:top w:type="dxa" w:w="80"/>
               <w:left w:type="dxa" w:w="120"/>
@@ -7484,7 +7480,7 @@
         <w:tc>
           <w:tcPr>
             <w:tcW w:type="dxa" w:w="6740"/>
-            <w:shd w:fill="ECFDF5" w:val="clear"/>
+            <w:shd w:val="clear" w:color="auto" w:fill="ECFDF5"/>
             <w:tcMar>
               <w:top w:type="dxa" w:w="80"/>
               <w:left w:type="dxa" w:w="120"/>
@@ -7508,7 +7504,7 @@
         <w:tc>
           <w:tcPr>
             <w:tcW w:type="dxa" w:w="500"/>
-            <w:shd w:fill="FFFFFF" w:val="clear"/>
+            <w:shd w:val="clear" w:color="auto" w:fill="FFFFFF"/>
             <w:tcMar>
               <w:top w:type="dxa" w:w="80"/>
               <w:left w:type="dxa" w:w="120"/>
@@ -7532,7 +7528,7 @@
         <w:tc>
           <w:tcPr>
             <w:tcW w:type="dxa" w:w="4500"/>
-            <w:shd w:fill="FFFFFF" w:val="clear"/>
+            <w:shd w:val="clear" w:color="auto" w:fill="FFFFFF"/>
             <w:tcMar>
               <w:top w:type="dxa" w:w="80"/>
               <w:left w:type="dxa" w:w="120"/>
@@ -7554,7 +7550,7 @@
         <w:tc>
           <w:tcPr>
             <w:tcW w:type="dxa" w:w="2500"/>
-            <w:shd w:fill="FFFFFF" w:val="clear"/>
+            <w:shd w:val="clear" w:color="auto" w:fill="FFFFFF"/>
             <w:tcMar>
               <w:top w:type="dxa" w:w="80"/>
               <w:left w:type="dxa" w:w="120"/>
@@ -7576,7 +7572,7 @@
         <w:tc>
           <w:tcPr>
             <w:tcW w:type="dxa" w:w="6740"/>
-            <w:shd w:fill="FFFFFF" w:val="clear"/>
+            <w:shd w:val="clear" w:color="auto" w:fill="FFFFFF"/>
             <w:tcMar>
               <w:top w:type="dxa" w:w="80"/>
               <w:left w:type="dxa" w:w="120"/>
@@ -7600,7 +7596,7 @@
         <w:tc>
           <w:tcPr>
             <w:tcW w:type="dxa" w:w="500"/>
-            <w:shd w:fill="ECFDF5" w:val="clear"/>
+            <w:shd w:val="clear" w:color="auto" w:fill="ECFDF5"/>
             <w:tcMar>
               <w:top w:type="dxa" w:w="80"/>
               <w:left w:type="dxa" w:w="120"/>
@@ -7624,7 +7620,7 @@
         <w:tc>
           <w:tcPr>
             <w:tcW w:type="dxa" w:w="4500"/>
-            <w:shd w:fill="ECFDF5" w:val="clear"/>
+            <w:shd w:val="clear" w:color="auto" w:fill="ECFDF5"/>
             <w:tcMar>
               <w:top w:type="dxa" w:w="80"/>
               <w:left w:type="dxa" w:w="120"/>
@@ -7646,7 +7642,7 @@
         <w:tc>
           <w:tcPr>
             <w:tcW w:type="dxa" w:w="2500"/>
-            <w:shd w:fill="ECFDF5" w:val="clear"/>
+            <w:shd w:val="clear" w:color="auto" w:fill="ECFDF5"/>
             <w:tcMar>
               <w:top w:type="dxa" w:w="80"/>
               <w:left w:type="dxa" w:w="120"/>
@@ -7668,7 +7664,7 @@
         <w:tc>
           <w:tcPr>
             <w:tcW w:type="dxa" w:w="6740"/>
-            <w:shd w:fill="ECFDF5" w:val="clear"/>
+            <w:shd w:val="clear" w:color="auto" w:fill="ECFDF5"/>
             <w:tcMar>
               <w:top w:type="dxa" w:w="80"/>
               <w:left w:type="dxa" w:w="120"/>
@@ -7692,7 +7688,7 @@
         <w:tc>
           <w:tcPr>
             <w:tcW w:type="dxa" w:w="500"/>
-            <w:shd w:fill="FFFFFF" w:val="clear"/>
+            <w:shd w:val="clear" w:color="auto" w:fill="FFFFFF"/>
             <w:tcMar>
               <w:top w:type="dxa" w:w="80"/>
               <w:left w:type="dxa" w:w="120"/>
@@ -7716,7 +7712,7 @@
         <w:tc>
           <w:tcPr>
             <w:tcW w:type="dxa" w:w="4500"/>
-            <w:shd w:fill="FFFFFF" w:val="clear"/>
+            <w:shd w:val="clear" w:color="auto" w:fill="FFFFFF"/>
             <w:tcMar>
               <w:top w:type="dxa" w:w="80"/>
               <w:left w:type="dxa" w:w="120"/>
@@ -7738,7 +7734,7 @@
         <w:tc>
           <w:tcPr>
             <w:tcW w:type="dxa" w:w="2500"/>
-            <w:shd w:fill="FFFFFF" w:val="clear"/>
+            <w:shd w:val="clear" w:color="auto" w:fill="FFFFFF"/>
             <w:tcMar>
               <w:top w:type="dxa" w:w="80"/>
               <w:left w:type="dxa" w:w="120"/>
@@ -7760,7 +7756,7 @@
         <w:tc>
           <w:tcPr>
             <w:tcW w:type="dxa" w:w="6740"/>
-            <w:shd w:fill="FFFFFF" w:val="clear"/>
+            <w:shd w:val="clear" w:color="auto" w:fill="FFFFFF"/>
             <w:tcMar>
               <w:top w:type="dxa" w:w="80"/>
               <w:left w:type="dxa" w:w="120"/>
@@ -7784,7 +7780,7 @@
         <w:tc>
           <w:tcPr>
             <w:tcW w:type="dxa" w:w="500"/>
-            <w:shd w:fill="ECFDF5" w:val="clear"/>
+            <w:shd w:val="clear" w:color="auto" w:fill="ECFDF5"/>
             <w:tcMar>
               <w:top w:type="dxa" w:w="80"/>
               <w:left w:type="dxa" w:w="120"/>
@@ -7808,7 +7804,7 @@
         <w:tc>
           <w:tcPr>
             <w:tcW w:type="dxa" w:w="4500"/>
-            <w:shd w:fill="ECFDF5" w:val="clear"/>
+            <w:shd w:val="clear" w:color="auto" w:fill="ECFDF5"/>
             <w:tcMar>
               <w:top w:type="dxa" w:w="80"/>
               <w:left w:type="dxa" w:w="120"/>
@@ -7830,7 +7826,7 @@
         <w:tc>
           <w:tcPr>
             <w:tcW w:type="dxa" w:w="2500"/>
-            <w:shd w:fill="ECFDF5" w:val="clear"/>
+            <w:shd w:val="clear" w:color="auto" w:fill="ECFDF5"/>
             <w:tcMar>
               <w:top w:type="dxa" w:w="80"/>
               <w:left w:type="dxa" w:w="120"/>
@@ -7852,7 +7848,7 @@
         <w:tc>
           <w:tcPr>
             <w:tcW w:type="dxa" w:w="6740"/>
-            <w:shd w:fill="ECFDF5" w:val="clear"/>
+            <w:shd w:val="clear" w:color="auto" w:fill="ECFDF5"/>
             <w:tcMar>
               <w:top w:type="dxa" w:w="80"/>
               <w:left w:type="dxa" w:w="120"/>
@@ -7876,7 +7872,7 @@
         <w:tc>
           <w:tcPr>
             <w:tcW w:type="dxa" w:w="500"/>
-            <w:shd w:fill="FFFFFF" w:val="clear"/>
+            <w:shd w:val="clear" w:color="auto" w:fill="FFFFFF"/>
             <w:tcMar>
               <w:top w:type="dxa" w:w="80"/>
               <w:left w:type="dxa" w:w="120"/>
@@ -7900,7 +7896,7 @@
         <w:tc>
           <w:tcPr>
             <w:tcW w:type="dxa" w:w="4500"/>
-            <w:shd w:fill="FFFFFF" w:val="clear"/>
+            <w:shd w:val="clear" w:color="auto" w:fill="FFFFFF"/>
             <w:tcMar>
               <w:top w:type="dxa" w:w="80"/>
               <w:left w:type="dxa" w:w="120"/>
@@ -7922,7 +7918,7 @@
         <w:tc>
           <w:tcPr>
             <w:tcW w:type="dxa" w:w="2500"/>
-            <w:shd w:fill="FFFFFF" w:val="clear"/>
+            <w:shd w:val="clear" w:color="auto" w:fill="FFFFFF"/>
             <w:tcMar>
               <w:top w:type="dxa" w:w="80"/>
               <w:left w:type="dxa" w:w="120"/>
@@ -7944,7 +7940,7 @@
         <w:tc>
           <w:tcPr>
             <w:tcW w:type="dxa" w:w="6740"/>
-            <w:shd w:fill="FFFFFF" w:val="clear"/>
+            <w:shd w:val="clear" w:color="auto" w:fill="FFFFFF"/>
             <w:tcMar>
               <w:top w:type="dxa" w:w="80"/>
               <w:left w:type="dxa" w:w="120"/>
@@ -8201,7 +8197,7 @@
               <w:bottom w:val="single" w:color="4338CA" w:sz="4"/>
               <w:right w:val="single" w:color="4338CA" w:sz="4"/>
             </w:tcBorders>
-            <w:shd w:fill="EEF2FF" w:val="clear"/>
+            <w:shd w:val="clear" w:color="auto" w:fill="EEF2FF"/>
             <w:tcMar>
               <w:top w:type="dxa" w:w="100"/>
               <w:left w:type="dxa" w:w="200"/>
@@ -8253,6 +8249,444 @@
           <w:szCs w:val="16"/>
         </w:rPr>
         <w:t xml:space="preserve">Yahweh HRMS  ·  Feature Audit &amp; Roadmap  ·  Confidential  ·  July 2026</w:t>
+      </w:r>
+    </w:p>
+    <w:p>
+      <w:pPr>
+        <w:pStyle w:val="Heading1"/>
+      </w:pPr>
+      <w:r>
+        <w:t>SECTION 5 — BUILD PROGRESS LOG</w:t>
+      </w:r>
+    </w:p>
+    <w:p>
+      <w:r>
+        <w:rPr>
+          <w:i/>
+        </w:rPr>
+        <w:t>Tracks completed development items. Last updated: August 2026.</w:t>
+      </w:r>
+    </w:p>
+    <w:p>
+      <w:pPr>
+        <w:pStyle w:val="Heading2"/>
+      </w:pPr>
+      <w:r>
+        <w:t>✓ COMPLETED ITEMS</w:t>
+      </w:r>
+    </w:p>
+    <w:tbl>
+      <w:tblPr>
+        <w:tblStyle w:val="TableGrid"/>
+        <w:tblW w:w="9360" w:type="dxa"/>
+        <w:tblBorders>
+          <w:top w:val="single" w:sz="4" w:space="0" w:color="D1D5DB"/>
+          <w:left w:val="single" w:sz="4" w:space="0" w:color="D1D5DB"/>
+          <w:bottom w:val="single" w:sz="4" w:space="0" w:color="D1D5DB"/>
+          <w:right w:val="single" w:sz="4" w:space="0" w:color="D1D5DB"/>
+          <w:insideH w:val="single" w:sz="4" w:space="0" w:color="D1D5DB"/>
+          <w:insideV w:val="single" w:sz="4" w:space="0" w:color="D1D5DB"/>
+        </w:tblBorders>
+      </w:tblPr>
+      <w:tblGrid>
+        <w:gridCol w:w="400"/>
+        <w:gridCol w:w="2600"/>
+        <w:gridCol w:w="3000"/>
+        <w:gridCol w:w="1680"/>
+        <w:gridCol w:w="1680"/>
+      </w:tblGrid>
+      <w:tr>
+        <w:trPr/>
+        <w:tc>
+          <w:tcPr>
+            <w:tcW w:w="400" w:type="dxa"/>
+            <w:shd w:val="clear" w:color="auto" w:fill="1E3A5F"/>
+          </w:tcPr>
+          <w:p>
+            <w:r>
+              <w:rPr>
+                <w:b/>
+                <w:color w:val="FFFFFF"/>
+              </w:rPr>
+              <w:t>#</w:t>
+            </w:r>
+          </w:p>
+        </w:tc>
+        <w:tc>
+          <w:tcPr>
+            <w:tcW w:w="2600" w:type="dxa"/>
+            <w:shd w:val="clear" w:color="auto" w:fill="1E3A5F"/>
+          </w:tcPr>
+          <w:p>
+            <w:r>
+              <w:rPr>
+                <w:b/>
+                <w:color w:val="FFFFFF"/>
+              </w:rPr>
+              <w:t>Feature / Module</w:t>
+            </w:r>
+          </w:p>
+        </w:tc>
+        <w:tc>
+          <w:tcPr>
+            <w:tcW w:w="3000" w:type="dxa"/>
+            <w:shd w:val="clear" w:color="auto" w:fill="1E3A5F"/>
+          </w:tcPr>
+          <w:p>
+            <w:r>
+              <w:rPr>
+                <w:b/>
+                <w:color w:val="FFFFFF"/>
+              </w:rPr>
+              <w:t>What was built</w:t>
+            </w:r>
+          </w:p>
+        </w:tc>
+        <w:tc>
+          <w:tcPr>
+            <w:tcW w:w="1680" w:type="dxa"/>
+            <w:shd w:val="clear" w:color="auto" w:fill="1E3A5F"/>
+          </w:tcPr>
+          <w:p>
+            <w:r>
+              <w:rPr>
+                <w:b/>
+                <w:color w:val="FFFFFF"/>
+              </w:rPr>
+              <w:t>Status</w:t>
+            </w:r>
+          </w:p>
+        </w:tc>
+        <w:tc>
+          <w:tcPr>
+            <w:tcW w:w="1680" w:type="dxa"/>
+            <w:shd w:val="clear" w:color="auto" w:fill="1E3A5F"/>
+          </w:tcPr>
+          <w:p>
+            <w:r>
+              <w:rPr>
+                <w:b/>
+                <w:color w:val="FFFFFF"/>
+              </w:rPr>
+              <w:t>Date</w:t>
+            </w:r>
+          </w:p>
+        </w:tc>
+      </w:tr>
+      <w:tr>
+        <w:tc>
+          <w:tcPr>
+            <w:tcW w:w="400" w:type="dxa"/>
+          </w:tcPr>
+          <w:p>
+            <w:r>
+              <w:rPr>
+                <w:b/>
+              </w:rPr>
+              <w:t>1</w:t>
+            </w:r>
+          </w:p>
+        </w:tc>
+        <w:tc>
+          <w:tcPr>
+            <w:tcW w:w="2600" w:type="dxa"/>
+          </w:tcPr>
+          <w:p>
+            <w:r>
+              <w:rPr>
+                <w:b/>
+              </w:rPr>
+              <w:t>Super Admin Frontend UI</w:t>
+            </w:r>
+          </w:p>
+        </w:tc>
+        <w:tc>
+          <w:tcPr>
+            <w:tcW w:w="3000" w:type="dxa"/>
+          </w:tcPr>
+          <w:p>
+            <w:r>
+              <w:t>Dashboard, client management, modules toggle, settings, billing, admins, audit logs, announcements, system pages</w:t>
+            </w:r>
+          </w:p>
+        </w:tc>
+        <w:tc>
+          <w:tcPr>
+            <w:tcW w:w="1680" w:type="dxa"/>
+          </w:tcPr>
+          <w:p>
+            <w:r>
+              <w:rPr>
+                <w:b/>
+                <w:color w:val="16A34A"/>
+              </w:rPr>
+              <w:t>✓ COMPLETE</w:t>
+            </w:r>
+          </w:p>
+        </w:tc>
+        <w:tc>
+          <w:tcPr>
+            <w:tcW w:w="1680" w:type="dxa"/>
+          </w:tcPr>
+          <w:p>
+            <w:r>
+              <w:t>Aug 2026</w:t>
+            </w:r>
+          </w:p>
+        </w:tc>
+      </w:tr>
+      <w:tr>
+        <w:tc>
+          <w:tcPr>
+            <w:tcW w:w="400" w:type="dxa"/>
+          </w:tcPr>
+          <w:p>
+            <w:r>
+              <w:rPr>
+                <w:b/>
+              </w:rPr>
+              <w:t>2</w:t>
+            </w:r>
+          </w:p>
+        </w:tc>
+        <w:tc>
+          <w:tcPr>
+            <w:tcW w:w="2600" w:type="dxa"/>
+          </w:tcPr>
+          <w:p>
+            <w:r>
+              <w:rPr>
+                <w:b/>
+              </w:rPr>
+              <w:t>CRM Module</w:t>
+            </w:r>
+          </w:p>
+        </w:tc>
+        <w:tc>
+          <w:tcPr>
+            <w:tcW w:w="3000" w:type="dxa"/>
+          </w:tcPr>
+          <w:p>
+            <w:r>
+              <w:t>DB schema (5 tables: leads, contacts, accounts, deals, activities), full API routes, UI with Kanban pipeline, tabs, modals</w:t>
+            </w:r>
+          </w:p>
+        </w:tc>
+        <w:tc>
+          <w:tcPr>
+            <w:tcW w:w="1680" w:type="dxa"/>
+          </w:tcPr>
+          <w:p>
+            <w:r>
+              <w:rPr>
+                <w:b/>
+                <w:color w:val="16A34A"/>
+              </w:rPr>
+              <w:t>✓ COMPLETE</w:t>
+            </w:r>
+          </w:p>
+        </w:tc>
+        <w:tc>
+          <w:tcPr>
+            <w:tcW w:w="1680" w:type="dxa"/>
+          </w:tcPr>
+          <w:p>
+            <w:r>
+              <w:t>Aug 2026</w:t>
+            </w:r>
+          </w:p>
+        </w:tc>
+      </w:tr>
+      <w:tr>
+        <w:tc>
+          <w:tcPr>
+            <w:tcW w:w="400" w:type="dxa"/>
+          </w:tcPr>
+          <w:p>
+            <w:r>
+              <w:rPr>
+                <w:b/>
+              </w:rPr>
+              <w:t>3</w:t>
+            </w:r>
+          </w:p>
+        </w:tc>
+        <w:tc>
+          <w:tcPr>
+            <w:tcW w:w="2600" w:type="dxa"/>
+          </w:tcPr>
+          <w:p>
+            <w:r>
+              <w:rPr>
+                <w:b/>
+              </w:rPr>
+              <w:t>Public Career Site</w:t>
+            </w:r>
+          </w:p>
+        </w:tc>
+        <w:tc>
+          <w:tcPr>
+            <w:tcW w:w="3000" w:type="dxa"/>
+          </w:tcPr>
+          <w:p>
+            <w:r>
+              <w:t>Job board at /careers/[tenantSlug] with org branding, open listings, apply modal (resume upload + cover letter), auto-submit to recruitment pipeline</w:t>
+            </w:r>
+          </w:p>
+        </w:tc>
+        <w:tc>
+          <w:tcPr>
+            <w:tcW w:w="1680" w:type="dxa"/>
+          </w:tcPr>
+          <w:p>
+            <w:r>
+              <w:rPr>
+                <w:b/>
+                <w:color w:val="16A34A"/>
+              </w:rPr>
+              <w:t>✓ COMPLETE</w:t>
+            </w:r>
+          </w:p>
+        </w:tc>
+        <w:tc>
+          <w:tcPr>
+            <w:tcW w:w="1680" w:type="dxa"/>
+          </w:tcPr>
+          <w:p>
+            <w:r>
+              <w:t>Aug 2026</w:t>
+            </w:r>
+          </w:p>
+        </w:tc>
+      </w:tr>
+      <w:tr>
+        <w:tc>
+          <w:tcPr>
+            <w:tcW w:w="400" w:type="dxa"/>
+          </w:tcPr>
+          <w:p>
+            <w:r>
+              <w:rPr>
+                <w:b/>
+              </w:rPr>
+              <w:t>4</w:t>
+            </w:r>
+          </w:p>
+        </w:tc>
+        <w:tc>
+          <w:tcPr>
+            <w:tcW w:w="2600" w:type="dxa"/>
+          </w:tcPr>
+          <w:p>
+            <w:r>
+              <w:rPr>
+                <w:b/>
+              </w:rPr>
+              <w:t>Promotion Approval → Employee Record Sync</w:t>
+            </w:r>
+          </w:p>
+        </w:tc>
+        <w:tc>
+          <w:tcPr>
+            <w:tcW w:w="3000" w:type="dxa"/>
+          </w:tcPr>
+          <w:p>
+            <w:r>
+              <w:t>When promotion marked “implemented”, both job title and annual salary are automatically updated on the employee record</w:t>
+            </w:r>
+          </w:p>
+        </w:tc>
+        <w:tc>
+          <w:tcPr>
+            <w:tcW w:w="1680" w:type="dxa"/>
+          </w:tcPr>
+          <w:p>
+            <w:r>
+              <w:rPr>
+                <w:b/>
+                <w:color w:val="16A34A"/>
+              </w:rPr>
+              <w:t>✓ COMPLETE</w:t>
+            </w:r>
+          </w:p>
+        </w:tc>
+        <w:tc>
+          <w:tcPr>
+            <w:tcW w:w="1680" w:type="dxa"/>
+          </w:tcPr>
+          <w:p>
+            <w:r>
+              <w:t>Aug 2026</w:t>
+            </w:r>
+          </w:p>
+        </w:tc>
+      </w:tr>
+      <w:tr>
+        <w:tc>
+          <w:tcPr>
+            <w:tcW w:w="400" w:type="dxa"/>
+          </w:tcPr>
+          <w:p>
+            <w:r>
+              <w:rPr>
+                <w:b/>
+              </w:rPr>
+              <w:t>5</w:t>
+            </w:r>
+          </w:p>
+        </w:tc>
+        <w:tc>
+          <w:tcPr>
+            <w:tcW w:w="2600" w:type="dxa"/>
+          </w:tcPr>
+          <w:p>
+            <w:r>
+              <w:rPr>
+                <w:b/>
+              </w:rPr>
+              <w:t>Expense Management Module</w:t>
+            </w:r>
+          </w:p>
+        </w:tc>
+        <w:tc>
+          <w:tcPr>
+            <w:tcW w:w="3000" w:type="dxa"/>
+          </w:tcPr>
+          <w:p>
+            <w:r>
+              <w:t>DB schema (expense_claims table + 3 indexes), full API (list, create, get, approve/reject/pay, delete), UI with summary cards, submit modal, review modal, receipt upload, filters</w:t>
+            </w:r>
+          </w:p>
+        </w:tc>
+        <w:tc>
+          <w:tcPr>
+            <w:tcW w:w="1680" w:type="dxa"/>
+          </w:tcPr>
+          <w:p>
+            <w:r>
+              <w:rPr>
+                <w:b/>
+                <w:color w:val="16A34A"/>
+              </w:rPr>
+              <w:t>✓ COMPLETE</w:t>
+            </w:r>
+          </w:p>
+        </w:tc>
+        <w:tc>
+          <w:tcPr>
+            <w:tcW w:w="1680" w:type="dxa"/>
+          </w:tcPr>
+          <w:p>
+            <w:r>
+              <w:t>Aug 2026</w:t>
+            </w:r>
+          </w:p>
+        </w:tc>
+      </w:tr>
+    </w:tbl>
+    <w:p>
+      <w:r>
+        <w:t/>
       </w:r>
     </w:p>
     <w:sectPr>

</xml_diff>